<commit_message>
docs(group-03): technical dossier docx and pdf with the repository-answerable fields filled
Personal attestations (authorship, LinkedIn, AI audit, peer review, learning record, sign-off) are intentionally left for the team members.

Co-Authored-By: Claude Sonnet 5.5 <noreply@anthropic.com>
</commit_message>
<xml_diff>
--- a/Group_03_Kashish_Vaishnavi/docs/MDRIIA_Group_03_Technical_Dossier.docx
+++ b/Group_03_Kashish_Vaishnavi/docs/MDRIIA_Group_03_Technical_Dossier.docx
@@ -1103,7 +1103,7 @@
                     <w:sz w:val="14"/>
                     <w:szCs w:val="14"/>
                   </w:rPr>
-                  <w:t xml:space="preserve">type here</w:t>
+                  <w:t xml:space="preserve">Kim TY et al. (2026) 2025 Korean CPR Guidelines Part 4, Clin Exp Emerg Med 13:S32-S60, doi:10.15441/ceem.26.073: 7-10 %/min without CPR (a guideline rule of thumb, not a fitted coefficient). Larsen MP et al. (1993) Ann Emerg Med 22(11):1652-1658, doi:10.1016/S0196-0644(05)81302-2: fitted loss 0.023 (CPR) + 0.011 (shock) + 0.021 (ACLS) = 5.5 %/min; the starter value 0.046 for the shock term is not in that model.</w:t>
                 </w:r>
               </w:sdtContent>
             </w:sdt>
@@ -1143,7 +1143,7 @@
                     <w:sz w:val="14"/>
                     <w:szCs w:val="14"/>
                   </w:rPr>
-                  <w:t xml:space="preserve">Select ▾</w:t>
+                  <w:t xml:space="preserve">Peer-reviewed paper (DOI)</w:t>
                 </w:r>
               </w:sdtContent>
             </w:sdt>
@@ -1180,7 +1180,7 @@
                     <w:sz w:val="14"/>
                     <w:szCs w:val="14"/>
                   </w:rPr>
-                  <w:t xml:space="preserve">Select ▾</w:t>
+                  <w:t xml:space="preserve">Correct</w:t>
                 </w:r>
               </w:sdtContent>
             </w:sdt>
@@ -1260,7 +1260,7 @@
                     <w:sz w:val="14"/>
                     <w:szCs w:val="14"/>
                   </w:rPr>
-                  <w:t xml:space="preserve">type here</w:t>
+                  <w:t xml:space="preserve">No primary source found for 700,000 deaths or &lt;2 % survival. Regional evidence: Telangana WACAR registry (PMC12369094) reports ROSC &lt;10 % and 1.3 % discharge; an Indian Heart Journal 2023 review gives survival &lt;10 %. India has no national arrest registry. The 700,000 figure appears only in an uncited hospital blog.</w:t>
                 </w:r>
               </w:sdtContent>
             </w:sdt>
@@ -1300,7 +1300,7 @@
                     <w:sz w:val="14"/>
                     <w:szCs w:val="14"/>
                   </w:rPr>
-                  <w:t xml:space="preserve">Select ▾</w:t>
+                  <w:t xml:space="preserve">No source found</w:t>
                 </w:r>
               </w:sdtContent>
             </w:sdt>
@@ -1337,7 +1337,7 @@
                     <w:sz w:val="14"/>
                     <w:szCs w:val="14"/>
                   </w:rPr>
-                  <w:t xml:space="preserve">Select ▾</w:t>
+                  <w:t xml:space="preserve">Delete</w:t>
                 </w:r>
               </w:sdtContent>
             </w:sdt>
@@ -1414,7 +1414,7 @@
                     <w:sz w:val="14"/>
                     <w:szCs w:val="14"/>
                   </w:rPr>
-                  <w:t xml:space="preserve">type here</w:t>
+                  <w:t xml:space="preserve">Naess LE et al. (2024) PLOS ONE 19, doi:10.1371/journal.pone.0296308 (Central Norway, n=216,787): urban response median 10.0 min, 90th percentile 17.7 min. Not an Indian city and not 15-20 min as a median; no Mumbai-specific peer-reviewed study was found. 15-20 min is therefore run as a scenario.</w:t>
                 </w:r>
               </w:sdtContent>
             </w:sdt>
@@ -1453,7 +1453,7 @@
                     <w:sz w:val="14"/>
                     <w:szCs w:val="14"/>
                   </w:rPr>
-                  <w:t xml:space="preserve">Select ▾</w:t>
+                  <w:t xml:space="preserve">Peer-reviewed paper (DOI)</w:t>
                 </w:r>
               </w:sdtContent>
             </w:sdt>
@@ -1489,7 +1489,7 @@
                     <w:sz w:val="14"/>
                     <w:szCs w:val="14"/>
                   </w:rPr>
-                  <w:t xml:space="preserve">Select ▾</w:t>
+                  <w:t xml:space="preserve">Correct</w:t>
                 </w:r>
               </w:sdtContent>
             </w:sdt>
@@ -1760,7 +1760,7 @@
                     <w:sz w:val="14"/>
                     <w:szCs w:val="14"/>
                   </w:rPr>
-                  <w:t xml:space="preserve">Select ▾</w:t>
+                  <w:t xml:space="preserve">No</w:t>
                 </w:r>
               </w:sdtContent>
             </w:sdt>
@@ -1792,7 +1792,7 @@
                     <w:sz w:val="14"/>
                     <w:szCs w:val="14"/>
                   </w:rPr>
-                  <w:t xml:space="preserve">type here</w:t>
+                  <w:t xml:space="preserve">Industrial robot-arm cells. The pod is a mobile ground vehicle with no manipulator.</w:t>
                 </w:r>
               </w:sdtContent>
             </w:sdt>
@@ -1897,7 +1897,7 @@
                     <w:sz w:val="14"/>
                     <w:szCs w:val="14"/>
                   </w:rPr>
-                  <w:t xml:space="preserve">Select ▾</w:t>
+                  <w:t xml:space="preserve">Partly</w:t>
                 </w:r>
               </w:sdtContent>
             </w:sdt>
@@ -1929,7 +1929,7 @@
                     <w:sz w:val="14"/>
                     <w:szCs w:val="14"/>
                   </w:rPr>
-                  <w:t xml:space="preserve">type here</w:t>
+                  <w:t xml:space="preserve">Braking distance s = v^2/(2 mu g) + v t_detect, FOV &gt;= 180 deg, 1.5 m / 0.4 m zones (course manual 2.2). MET: s = 0.26 m at 1.8 m/s, mu = 1.0, t_detect = 50 ms Detection latency: DEVIATION: 100 ms modelled reaction time in the safety filter</w:t>
                 </w:r>
               </w:sdtContent>
             </w:sdt>
@@ -2034,7 +2034,7 @@
                     <w:sz w:val="14"/>
                     <w:szCs w:val="14"/>
                   </w:rPr>
-                  <w:t xml:space="preserve">Select ▾</w:t>
+                  <w:t xml:space="preserve">No</w:t>
                 </w:r>
               </w:sdtContent>
             </w:sdt>
@@ -2066,7 +2066,7 @@
                     <w:sz w:val="14"/>
                     <w:szCs w:val="14"/>
                   </w:rPr>
-                  <w:t xml:space="preserve">type here</w:t>
+                  <w:t xml:space="preserve">US adoption of ISO 10218; same reason: no industrial manipulator.</w:t>
                 </w:r>
               </w:sdtContent>
             </w:sdt>
@@ -2171,7 +2171,7 @@
                     <w:sz w:val="14"/>
                     <w:szCs w:val="14"/>
                   </w:rPr>
-                  <w:t xml:space="preserve">Select ▾</w:t>
+                  <w:t xml:space="preserve">Partly</w:t>
                 </w:r>
               </w:sdtContent>
             </w:sdt>
@@ -2203,7 +2203,7 @@
                     <w:sz w:val="14"/>
                     <w:szCs w:val="14"/>
                   </w:rPr>
-                  <w:t xml:space="preserve">type here</w:t>
+                  <w:t xml:space="preserve">The AED is the medical device; the pod only protects it from shock (budget 3 g). On the course vehicle at 3.5 m/s cruise, 250 runs: 92 % stay within 3 g, worst 4.62 g (deviation recorded).</w:t>
                 </w:r>
               </w:sdtContent>
             </w:sdt>
@@ -2304,7 +2304,7 @@
                     <w:sz w:val="14"/>
                     <w:szCs w:val="14"/>
                   </w:rPr>
-                  <w:t xml:space="preserve">Select ▾</w:t>
+                  <w:t xml:space="preserve">Yes</w:t>
                 </w:r>
               </w:sdtContent>
             </w:sdt>
@@ -2335,7 +2335,7 @@
                     <w:sz w:val="14"/>
                     <w:szCs w:val="14"/>
                   </w:rPr>
-                  <w:t xml:space="preserve">type here</w:t>
+                  <w:t xml:space="preserve">No standard covers sidewalk delivery robots in India. Design assumes the ISO 3691-4 / ISO 13482 limits above, a 3 g payload budget and an 18 deg roll limit. Recorded deviation: ISO 13482 shared-zone speed 0.8 m/s vs the pod's 1.4 m/s pedestrian cap (analytics/standards_check.csv).</w:t>
                 </w:r>
               </w:sdtContent>
             </w:sdt>
@@ -2427,7 +2427,7 @@
                     <w:sz w:val="15"/>
                     <w:szCs w:val="15"/>
                   </w:rPr>
-                  <w:t xml:space="preserve">type here</w:t>
+                  <w:t xml:space="preserve">Ambulance response (call to arrival), urban Central Norway: median 10.0 min, p90 17.7 min; survival lost without shock ~1.1 %/min (Larsen shock term). Course scenario 15-20 min is swept, not assumed.</w:t>
                 </w:r>
               </w:sdtContent>
             </w:sdt>
@@ -2486,7 +2486,7 @@
                     <w:sz w:val="15"/>
                     <w:szCs w:val="15"/>
                   </w:rPr>
-                  <w:t xml:space="preserve">type here</w:t>
+                  <w:t xml:space="preserve">Naess LE et al. 2024, PLOS ONE 19, doi:10.1371/journal.pone.0296308; Larsen MP et al. 1993, doi:10.1016/S0196-0644(05)81302-2</w:t>
                 </w:r>
               </w:sdtContent>
             </w:sdt>
@@ -2543,7 +2543,7 @@
                     <w:sz w:val="15"/>
                     <w:szCs w:val="15"/>
                   </w:rPr>
-                  <w:t xml:space="preserve">type here</w:t>
+                  <w:t xml:space="preserve">Out-of-hospital cardiac-arrest patient and bystander; EMS dispatchers and ALS crews (ambulance hours)</w:t>
                 </w:r>
               </w:sdtContent>
             </w:sdt>
@@ -3004,7 +3004,7 @@
                     <w:sz w:val="15"/>
                     <w:szCs w:val="15"/>
                   </w:rPr>
-                  <w:t xml:space="preserve">type here</w:t>
+                  <w:t xml:space="preserve">0.002 s (500 Hz); implicitfast integrator, pyramidal friction cone</w:t>
                 </w:r>
               </w:sdtContent>
             </w:sdt>
@@ -3063,7 +3063,7 @@
                     <w:sz w:val="15"/>
                     <w:szCs w:val="15"/>
                   </w:rPr>
-                  <w:t xml:space="preserve">type here</w:t>
+                  <w:t xml:space="preserve">course vehicle: tyre 1.1 sliding (the starter MJCF value), 0.005 torsional, 0.0001 rolling; the scenario sampler then draws the sliding coefficient from U(0.7, 1.1), and from U(0.35, 0.6) in the slippery family</w:t>
                 </w:r>
               </w:sdtContent>
             </w:sdt>
@@ -3122,7 +3122,7 @@
                     <w:sz w:val="15"/>
                     <w:szCs w:val="15"/>
                   </w:rPr>
-                  <w:t xml:space="preserve">type here</w:t>
+                  <w:t xml:space="preserve">tyre geom solref = 0.1252 s, damping ratio 1.0, calibrated so the effective radial tyre stiffness is the guide's k_t = 30 kN/m (30.0 kN/m measured with sim.validate.tyre_stiffness); the repository default 0.03 s gives ~196 kN/m. Suspension, masses and isolator are the guide's: k_s 4500 N/m, c_s 350 N s/m, 6.5 kg sprung and 2.25 kg unsprung per corner</w:t>
                 </w:r>
               </w:sdtContent>
             </w:sdt>
@@ -3189,7 +3189,7 @@
                     <w:sz w:val="15"/>
                     <w:szCs w:val="15"/>
                   </w:rPr>
-                  <w:t xml:space="preserve">Select ▾</w:t>
+                  <w:t xml:space="preserve">Potential field / DWA</w:t>
                 </w:r>
               </w:sdtContent>
             </w:sdt>
@@ -3248,7 +3248,7 @@
                     <w:sz w:val="15"/>
                     <w:szCs w:val="15"/>
                   </w:rPr>
-                  <w:t xml:space="preserve">type here</w:t>
+                  <w:t xml:space="preserve">DWA scoring weights: progress 1.0, centring 0.5, speed 1.0, clearance 1.2, heading 0.2; horizon 2.4 s, dt 0.15 s, a_max 1.6 m/s^2, a_brake 2.0 m/s^2; FSM caps: ROAD_CRUISE 3.5 m/s (the guide's value), CURB_SIDEWALK &gt;= 1.2 m/s, launch 1.0 m/s^2, brake 1.5 m/s^2</w:t>
                 </w:r>
               </w:sdtContent>
             </w:sdt>
@@ -3307,7 +3307,7 @@
                     <w:sz w:val="15"/>
                     <w:szCs w:val="15"/>
                   </w:rPr>
-                  <w:t xml:space="preserve">type here</w:t>
+                  <w:t xml:space="preserve">DISPATCH, ROAD_CRUISE, CURB_SIDEWALK, ARRIVE, AED_HANDOVER (src/aedrover/capstone/fsm.py)</w:t>
                 </w:r>
               </w:sdtContent>
             </w:sdt>
@@ -3368,7 +3368,7 @@
                     <w:sz w:val="15"/>
                     <w:szCs w:val="15"/>
                   </w:rPr>
-                  <w:t xml:space="preserve">Select ▾</w:t>
+                  <w:t xml:space="preserve">Yes</w:t>
                 </w:r>
               </w:sdtContent>
             </w:sdt>
@@ -4247,15 +4247,324 @@
               <w:spacing w:after="0"/>
               <w:jc w:val="center"/>
             </w:pPr>
-            <w:r/>
             <w:r>
               <w:rPr>
-                <w:b w:val="0"/>
-                <w:i/>
-                <w:color w:val="595959"/>
-                <w:sz w:val="15"/>
+                <w:rFonts w:ascii="Consolas" w:hAnsi="Consolas"/>
+                <w:sz w:val="16"/>
               </w:rPr>
-              <w:t>[ Paste code as text (Consolas 8 pt), not a screenshot. Include the file name and line numbers. ]</w:t>
+              <w:t>src/aedrover/capstone/fsm.py  (lines 104-127)</w:t>
+            </w:r>
+          </w:p>
+          <w:p>
+            <w:pPr>
+              <w:spacing w:after="0"/>
+              <w:jc w:val="center"/>
+            </w:pPr>
+            <w:r>
+              <w:rPr>
+                <w:rFonts w:ascii="Consolas" w:hAnsi="Consolas"/>
+                <w:sz w:val="16"/>
+              </w:rPr>
+              <w:t xml:space="preserve"> 104      def update(self, obs: dict) -&gt; State:</w:t>
+            </w:r>
+          </w:p>
+          <w:p>
+            <w:pPr>
+              <w:spacing w:after="0"/>
+              <w:jc w:val="center"/>
+            </w:pPr>
+            <w:r>
+              <w:rPr>
+                <w:rFonts w:ascii="Consolas" w:hAnsi="Consolas"/>
+                <w:sz w:val="16"/>
+              </w:rPr>
+              <w:t xml:space="preserve"> 105          """Advance the state machine from the observation; returns the new state."""</w:t>
+            </w:r>
+          </w:p>
+          <w:p>
+            <w:pPr>
+              <w:spacing w:after="0"/>
+              <w:jc w:val="center"/>
+            </w:pPr>
+            <w:r>
+              <w:rPr>
+                <w:rFonts w:ascii="Consolas" w:hAnsi="Consolas"/>
+                <w:sz w:val="16"/>
+              </w:rPr>
+              <w:t xml:space="preserve"> 106          p, t, x = self.params, obs["t"], obs["x"]</w:t>
+            </w:r>
+          </w:p>
+          <w:p>
+            <w:pPr>
+              <w:spacing w:after="0"/>
+              <w:jc w:val="center"/>
+            </w:pPr>
+            <w:r>
+              <w:rPr>
+                <w:rFonts w:ascii="Consolas" w:hAnsi="Consolas"/>
+                <w:sz w:val="16"/>
+              </w:rPr>
+              <w:t xml:space="preserve"> 107          if self.state is State.AED_HANDOVER:</w:t>
+            </w:r>
+          </w:p>
+          <w:p>
+            <w:pPr>
+              <w:spacing w:after="0"/>
+              <w:jc w:val="center"/>
+            </w:pPr>
+            <w:r>
+              <w:rPr>
+                <w:rFonts w:ascii="Consolas" w:hAnsi="Consolas"/>
+                <w:sz w:val="16"/>
+              </w:rPr>
+              <w:t xml:space="preserve"> 108              return self.state</w:t>
+            </w:r>
+          </w:p>
+          <w:p>
+            <w:pPr>
+              <w:spacing w:after="0"/>
+              <w:jc w:val="center"/>
+            </w:pPr>
+            <w:r>
+              <w:rPr>
+                <w:rFonts w:ascii="Consolas" w:hAnsi="Consolas"/>
+                <w:sz w:val="16"/>
+              </w:rPr>
+              <w:t xml:space="preserve"> 109          if self._sc.x_goal - x &lt;= p.arrive_m:</w:t>
+            </w:r>
+          </w:p>
+          <w:p>
+            <w:pPr>
+              <w:spacing w:after="0"/>
+              <w:jc w:val="center"/>
+            </w:pPr>
+            <w:r>
+              <w:rPr>
+                <w:rFonts w:ascii="Consolas" w:hAnsi="Consolas"/>
+                <w:sz w:val="16"/>
+              </w:rPr>
+              <w:t xml:space="preserve"> 110              self._go(t, State.ARRIVE, f"goal within {p.arrive_m:.1f} m")</w:t>
+            </w:r>
+          </w:p>
+          <w:p>
+            <w:pPr>
+              <w:spacing w:after="0"/>
+              <w:jc w:val="center"/>
+            </w:pPr>
+            <w:r>
+              <w:rPr>
+                <w:rFonts w:ascii="Consolas" w:hAnsi="Consolas"/>
+                <w:sz w:val="16"/>
+              </w:rPr>
+              <w:t xml:space="preserve"> 111          elif self.state is State.DISPATCH:</w:t>
+            </w:r>
+          </w:p>
+          <w:p>
+            <w:pPr>
+              <w:spacing w:after="0"/>
+              <w:jc w:val="center"/>
+            </w:pPr>
+            <w:r>
+              <w:rPr>
+                <w:rFonts w:ascii="Consolas" w:hAnsi="Consolas"/>
+                <w:sz w:val="16"/>
+              </w:rPr>
+              <w:t xml:space="preserve"> 112              if t &gt;= p.t_dispatch_s:</w:t>
+            </w:r>
+          </w:p>
+          <w:p>
+            <w:pPr>
+              <w:spacing w:after="0"/>
+              <w:jc w:val="center"/>
+            </w:pPr>
+            <w:r>
+              <w:rPr>
+                <w:rFonts w:ascii="Consolas" w:hAnsi="Consolas"/>
+                <w:sz w:val="16"/>
+              </w:rPr>
+              <w:t xml:space="preserve"> 113                  self._go(t, State.ROAD_CRUISE, f"t &gt;= {p.t_dispatch_s:.1f} s")</w:t>
+            </w:r>
+          </w:p>
+          <w:p>
+            <w:pPr>
+              <w:spacing w:after="0"/>
+              <w:jc w:val="center"/>
+            </w:pPr>
+            <w:r>
+              <w:rPr>
+                <w:rFonts w:ascii="Consolas" w:hAnsi="Consolas"/>
+                <w:sz w:val="16"/>
+              </w:rPr>
+              <w:t xml:space="preserve"> 114          elif self.in_kerb_zone(x):</w:t>
+            </w:r>
+          </w:p>
+          <w:p>
+            <w:pPr>
+              <w:spacing w:after="0"/>
+              <w:jc w:val="center"/>
+            </w:pPr>
+            <w:r>
+              <w:rPr>
+                <w:rFonts w:ascii="Consolas" w:hAnsi="Consolas"/>
+                <w:sz w:val="16"/>
+              </w:rPr>
+              <w:t xml:space="preserve"> 115              self._go(t, State.CURB_SIDEWALK, "kerb edge ahead")</w:t>
+            </w:r>
+          </w:p>
+          <w:p>
+            <w:pPr>
+              <w:spacing w:after="0"/>
+              <w:jc w:val="center"/>
+            </w:pPr>
+            <w:r>
+              <w:rPr>
+                <w:rFonts w:ascii="Consolas" w:hAnsi="Consolas"/>
+                <w:sz w:val="16"/>
+              </w:rPr>
+              <w:t xml:space="preserve"> 116          elif self.state is State.CURB_SIDEWALK:</w:t>
+            </w:r>
+          </w:p>
+          <w:p>
+            <w:pPr>
+              <w:spacing w:after="0"/>
+              <w:jc w:val="center"/>
+            </w:pPr>
+            <w:r>
+              <w:rPr>
+                <w:rFonts w:ascii="Consolas" w:hAnsi="Consolas"/>
+                <w:sz w:val="16"/>
+              </w:rPr>
+              <w:t xml:space="preserve"> 117              self._go(t, State.ROAD_CRUISE, "kerb zone cleared")</w:t>
+            </w:r>
+          </w:p>
+          <w:p>
+            <w:pPr>
+              <w:spacing w:after="0"/>
+              <w:jc w:val="center"/>
+            </w:pPr>
+            <w:r>
+              <w:rPr>
+                <w:rFonts w:ascii="Consolas" w:hAnsi="Consolas"/>
+                <w:sz w:val="16"/>
+              </w:rPr>
+              <w:t xml:space="preserve"> 118          return self.state</w:t>
+            </w:r>
+          </w:p>
+          <w:p>
+            <w:pPr>
+              <w:spacing w:after="0"/>
+              <w:jc w:val="center"/>
+            </w:pPr>
+            <w:r>
+              <w:rPr>
+                <w:rFonts w:ascii="Consolas" w:hAnsi="Consolas"/>
+                <w:sz w:val="16"/>
+              </w:rPr>
+              <w:t xml:space="preserve"> 119  </w:t>
+            </w:r>
+          </w:p>
+          <w:p>
+            <w:pPr>
+              <w:spacing w:after="0"/>
+              <w:jc w:val="center"/>
+            </w:pPr>
+            <w:r>
+              <w:rPr>
+                <w:rFonts w:ascii="Consolas" w:hAnsi="Consolas"/>
+                <w:sz w:val="16"/>
+              </w:rPr>
+              <w:t xml:space="preserve"> 120      def begin_handover(self, t: float) -&gt; None:</w:t>
+            </w:r>
+          </w:p>
+          <w:p>
+            <w:pPr>
+              <w:spacing w:after="0"/>
+              <w:jc w:val="center"/>
+            </w:pPr>
+            <w:r>
+              <w:rPr>
+                <w:rFonts w:ascii="Consolas" w:hAnsi="Consolas"/>
+                <w:sz w:val="16"/>
+              </w:rPr>
+              <w:t xml:space="preserve"> 121          self._go(t, State.AED_HANDOVER, "goal reached, rover stationary")</w:t>
+            </w:r>
+          </w:p>
+          <w:p>
+            <w:pPr>
+              <w:spacing w:after="0"/>
+              <w:jc w:val="center"/>
+            </w:pPr>
+            <w:r>
+              <w:rPr>
+                <w:rFonts w:ascii="Consolas" w:hAnsi="Consolas"/>
+                <w:sz w:val="16"/>
+              </w:rPr>
+              <w:t xml:space="preserve"> 122  </w:t>
+            </w:r>
+          </w:p>
+          <w:p>
+            <w:pPr>
+              <w:spacing w:after="0"/>
+              <w:jc w:val="center"/>
+            </w:pPr>
+            <w:r>
+              <w:rPr>
+                <w:rFonts w:ascii="Consolas" w:hAnsi="Consolas"/>
+                <w:sz w:val="16"/>
+              </w:rPr>
+              <w:t xml:space="preserve"> 123      # ------------------------------------------------------------ speed cap</w:t>
+            </w:r>
+          </w:p>
+          <w:p>
+            <w:pPr>
+              <w:spacing w:after="0"/>
+              <w:jc w:val="center"/>
+            </w:pPr>
+            <w:r>
+              <w:rPr>
+                <w:rFonts w:ascii="Consolas" w:hAnsi="Consolas"/>
+                <w:sz w:val="16"/>
+              </w:rPr>
+              <w:t xml:space="preserve"> 124      def speed_cap(self, obs: dict) -&gt; float:</w:t>
+            </w:r>
+          </w:p>
+          <w:p>
+            <w:pPr>
+              <w:spacing w:after="0"/>
+              <w:jc w:val="center"/>
+            </w:pPr>
+            <w:r>
+              <w:rPr>
+                <w:rFonts w:ascii="Consolas" w:hAnsi="Consolas"/>
+                <w:sz w:val="16"/>
+              </w:rPr>
+              <w:t xml:space="preserve"> 125          p = self.params</w:t>
+            </w:r>
+          </w:p>
+          <w:p>
+            <w:pPr>
+              <w:spacing w:after="0"/>
+              <w:jc w:val="center"/>
+            </w:pPr>
+            <w:r>
+              <w:rPr>
+                <w:rFonts w:ascii="Consolas" w:hAnsi="Consolas"/>
+                <w:sz w:val="16"/>
+              </w:rPr>
+              <w:t xml:space="preserve"> 126          if self.state is State.DISPATCH:</w:t>
+            </w:r>
+          </w:p>
+          <w:p>
+            <w:pPr>
+              <w:spacing w:after="0"/>
+              <w:jc w:val="center"/>
+            </w:pPr>
+            <w:r>
+              <w:rPr>
+                <w:rFonts w:ascii="Consolas" w:hAnsi="Consolas"/>
+                <w:sz w:val="16"/>
+              </w:rPr>
+              <w:t xml:space="preserve"> 127              return p.a_launch * obs["t"] + p.v_floor</w:t>
             </w:r>
           </w:p>
         </w:tc>
@@ -4306,15 +4615,35 @@
               <w:spacing w:after="0"/>
               <w:jc w:val="center"/>
             </w:pPr>
-            <w:r/>
             <w:r>
-              <w:rPr>
-                <w:b w:val="0"/>
-                <w:i/>
-                <w:color w:val="595959"/>
-                <w:sz w:val="15"/>
-              </w:rPr>
-              <w:t>[ FBD (phone photo of a hand sketch is fine) → symbols explained → worked example → where this value appears in your telemetry CSV ]</w:t>
+              <w:t>Free-body diagram: hand sketch to be attached by the team (forces on one wheel: N, F_traction, F_roll, m g; chassis: payload isolator force).</w:t>
+            </w:r>
+          </w:p>
+          <w:p>
+            <w:pPr>
+              <w:spacing w:after="0"/>
+              <w:jc w:val="center"/>
+            </w:pPr>
+            <w:r>
+              <w:t>Symbols: TTFS = t_dispatch + d / v_bar + t_handover  (section 2, equation 3).</w:t>
+            </w:r>
+          </w:p>
+          <w:p>
+            <w:pPr>
+              <w:spacing w:after="0"/>
+              <w:jc w:val="center"/>
+            </w:pPr>
+            <w:r>
+              <w:t>Worked example (run seed 70000, condition free_flow): t_dispatch = collapse-to-call 1.0 + call-to-alert 1.5 = 2.5 min; d = 500 m x 1.54 = 770 m; v_bar = path/time = 36.01 m / 21.00 s = 1.715 m/s; t_handover = 1.0 min.</w:t>
+            </w:r>
+          </w:p>
+          <w:p>
+            <w:pPr>
+              <w:spacing w:after="0"/>
+              <w:jc w:val="center"/>
+            </w:pPr>
+            <w:r>
+              <w:t>TTFS = 2.5 + 770 / 1.715 / 60 + 1.0 = 10.983 min  (column ttfs_min of analytics/aed_delivery_real_trials.csv).</w:t>
             </w:r>
           </w:p>
         </w:tc>
@@ -4785,7 +5114,7 @@
                     <w:sz w:val="14"/>
                     <w:szCs w:val="14"/>
                   </w:rPr>
-                  <w:t xml:space="preserve">type here</w:t>
+                  <w:t xml:space="preserve">calls/day 3.77 (zone 50 km^2, density 20000/km^2, incidence 55/100k/yr, x2.5 suspected), p_standdown 0.15, 1.5 h/call - all ASSUMPTION</w:t>
                 </w:r>
               </w:sdtContent>
             </w:sdt>
@@ -4817,7 +5146,7 @@
                     <w:sz w:val="14"/>
                     <w:szCs w:val="14"/>
                   </w:rPr>
-                  <w:t xml:space="preserve">type here</w:t>
+                  <w:t xml:space="preserve">H_reclaimed = 0.848 ALS vehicle-h/day = 0.149 FTE</w:t>
                 </w:r>
               </w:sdtContent>
             </w:sdt>
@@ -4897,7 +5226,7 @@
                     <w:sz w:val="14"/>
                     <w:szCs w:val="14"/>
                   </w:rPr>
-                  <w:t xml:space="preserve">type here</w:t>
+                  <w:t xml:space="preserve">CapEx 34.6 ALS vehicle-yr (77 pods x 0.35 + 77 hubs x 0.1), life 8.0 yr, dOpEx = C_baseline - C_robot - ASSUMPTION</w:t>
                 </w:r>
               </w:sdtContent>
             </w:sdt>
@@ -4929,7 +5258,7 @@
                     <w:sz w:val="14"/>
                     <w:szCs w:val="14"/>
                   </w:rPr>
-                  <w:t xml:space="preserve">type here</w:t>
+                  <w:t xml:space="preserve">P_payback = inf (no payback: dOpEx &lt;= 0); T_payback = inf</w:t>
                 </w:r>
               </w:sdtContent>
             </w:sdt>
@@ -5009,7 +5338,7 @@
                     <w:sz w:val="14"/>
                     <w:szCs w:val="14"/>
                   </w:rPr>
-                  <w:t xml:space="preserve">type here</w:t>
+                  <w:t xml:space="preserve">C_robot 10, C_baseline 0.0353 ALS vehicle-yr/yr (pod opex 0.1, hub opex 0.03) - ASSUMPTION</w:t>
                 </w:r>
               </w:sdtContent>
             </w:sdt>
@@ -5041,7 +5370,7 @@
                     <w:sz w:val="14"/>
                     <w:szCs w:val="14"/>
                   </w:rPr>
-                  <w:t xml:space="preserve">type here</w:t>
+                  <w:t xml:space="preserve">kappa = 283; NCRI = -282 (course target kappa &lt;= 0.25: not met)</w:t>
                 </w:r>
               </w:sdtContent>
             </w:sdt>
@@ -5121,7 +5450,7 @@
                     <w:sz w:val="14"/>
                     <w:szCs w:val="14"/>
                   </w:rPr>
-                  <w:t xml:space="preserve">type here</w:t>
+                  <w:t xml:space="preserve">lambda 0.00204/h per hub, mu 2.19/h (service 27.5 min = round trip at measured 2.06 m/s + 0.25 h turnaround), c 1</w:t>
                 </w:r>
               </w:sdtContent>
             </w:sdt>
@@ -5153,7 +5482,7 @@
                     <w:sz w:val="14"/>
                     <w:szCs w:val="14"/>
                   </w:rPr>
-                  <w:t xml:space="preserve">type here</w:t>
+                  <w:t xml:space="preserve">rho = 0.000933; P(wait) = 0.000933; W_q = 0.0256 min</w:t>
                 </w:r>
               </w:sdtContent>
             </w:sdt>
@@ -5230,7 +5559,7 @@
                     <w:sz w:val="14"/>
                     <w:szCs w:val="14"/>
                   </w:rPr>
-                  <w:t xml:space="preserve">type here</w:t>
+                  <w:t xml:space="preserve">ohca_incidence_per_100k_yr (no verified national value), swept 0.5x to 400x of 55; +/-30 % band shaded</w:t>
                 </w:r>
               </w:sdtContent>
             </w:sdt>
@@ -5261,7 +5590,7 @@
                     <w:sz w:val="14"/>
                     <w:szCs w:val="14"/>
                   </w:rPr>
-                  <w:t xml:space="preserve">type here</w:t>
+                  <w:t xml:space="preserve">break-even kappa=1 (cost parity): 3.96e+04; break-even kappa=0.25 (course target): 2.41e+06</w:t>
                 </w:r>
               </w:sdtContent>
             </w:sdt>
@@ -5343,7 +5672,7 @@
                     <w:sz w:val="15"/>
                     <w:szCs w:val="15"/>
                   </w:rPr>
-                  <w:t xml:space="preserve">Select ▾</w:t>
+                  <w:t xml:space="preserve">M/M/c</w:t>
                 </w:r>
               </w:sdtContent>
             </w:sdt>
@@ -5402,7 +5731,7 @@
                     <w:sz w:val="15"/>
                     <w:szCs w:val="15"/>
                   </w:rPr>
-                  <w:t xml:space="preserve">type here</w:t>
+                  <w:t xml:space="preserve">lambda = 0.00204 /h, mu = 2.19 /h, c = 1 per hub</w:t>
                 </w:r>
               </w:sdtContent>
             </w:sdt>
@@ -5461,7 +5790,7 @@
                     <w:sz w:val="15"/>
                     <w:szCs w:val="15"/>
                   </w:rPr>
-                  <w:t xml:space="preserve">type here</w:t>
+                  <w:t xml:space="preserve">no payback (infinite): the labour lens does not cover pod cost; see docs/CAPSTONE.md for the health lens</w:t>
                 </w:r>
               </w:sdtContent>
             </w:sdt>
@@ -5522,7 +5851,7 @@
                     <w:sz w:val="15"/>
                     <w:szCs w:val="15"/>
                   </w:rPr>
-                  <w:t xml:space="preserve">Select ▾</w:t>
+                  <w:t xml:space="preserve">Yes</w:t>
                 </w:r>
               </w:sdtContent>
             </w:sdt>
@@ -5839,7 +6168,7 @@
                     <w:sz w:val="14"/>
                     <w:szCs w:val="14"/>
                   </w:rPr>
-                  <w:t xml:space="preserve">type here</w:t>
+                  <w:t xml:space="preserve">Injury to a bystander, mission abort, loss of trust</w:t>
                 </w:r>
               </w:sdtContent>
             </w:sdt>
@@ -5883,7 +6212,7 @@
                     <w:sz w:val="14"/>
                     <w:szCs w:val="14"/>
                   </w:rPr>
-                  <w:t xml:space="preserve">Select ▾</w:t>
+                  <w:t xml:space="preserve">9</w:t>
                 </w:r>
               </w:sdtContent>
             </w:sdt>
@@ -5927,7 +6256,7 @@
                     <w:sz w:val="14"/>
                     <w:szCs w:val="14"/>
                   </w:rPr>
-                  <w:t xml:space="preserve">Select ▾</w:t>
+                  <w:t xml:space="preserve">10</w:t>
                 </w:r>
               </w:sdtContent>
             </w:sdt>
@@ -5971,7 +6300,7 @@
                     <w:sz w:val="14"/>
                     <w:szCs w:val="14"/>
                   </w:rPr>
-                  <w:t xml:space="preserve">Select ▾</w:t>
+                  <w:t xml:space="preserve">6</w:t>
                 </w:r>
               </w:sdtContent>
             </w:sdt>
@@ -6003,7 +6332,7 @@
                     <w:sz w:val="14"/>
                     <w:szCs w:val="14"/>
                   </w:rPr>
-                  <w:t xml:space="preserve">type here</w:t>
+                  <w:t xml:space="preserve">540 (measured rate 54.8 %, baseline_unshielded, n=250)</w:t>
                 </w:r>
               </w:sdtContent>
             </w:sdt>
@@ -6035,7 +6364,7 @@
                     <w:sz w:val="14"/>
                     <w:szCs w:val="14"/>
                   </w:rPr>
-                  <w:t xml:space="preserve">type here</w:t>
+                  <w:t xml:space="preserve">CBF-style speed-and-separation safety filter on the swept footprint; DWA plans against predicted pedestrian motion</w:t>
                 </w:r>
               </w:sdtContent>
             </w:sdt>
@@ -6067,7 +6396,7 @@
                     <w:sz w:val="14"/>
                     <w:szCs w:val="14"/>
                   </w:rPr>
-                  <w:t xml:space="preserve">type here</w:t>
+                  <w:t xml:space="preserve">162 (O=6, D=3; measured rate 7.6 %, proposed, n=250)</w:t>
                 </w:r>
               </w:sdtContent>
             </w:sdt>
@@ -6105,7 +6434,7 @@
                     <w:sz w:val="14"/>
                     <w:szCs w:val="14"/>
                   </w:rPr>
-                  <w:t xml:space="preserve">Select ▾</w:t>
+                  <w:t xml:space="preserve">Both</w:t>
                 </w:r>
               </w:sdtContent>
             </w:sdt>
@@ -6164,7 +6493,7 @@
                     <w:sz w:val="14"/>
                     <w:szCs w:val="14"/>
                   </w:rPr>
-                  <w:t xml:space="preserve">type here</w:t>
+                  <w:t xml:space="preserve">AED capacitor or electrodes damaged, device unusable at the scene</w:t>
                 </w:r>
               </w:sdtContent>
             </w:sdt>
@@ -6208,7 +6537,7 @@
                     <w:sz w:val="14"/>
                     <w:szCs w:val="14"/>
                   </w:rPr>
-                  <w:t xml:space="preserve">Select ▾</w:t>
+                  <w:t xml:space="preserve">9</w:t>
                 </w:r>
               </w:sdtContent>
             </w:sdt>
@@ -6252,7 +6581,7 @@
                     <w:sz w:val="14"/>
                     <w:szCs w:val="14"/>
                   </w:rPr>
-                  <w:t xml:space="preserve">Select ▾</w:t>
+                  <w:t xml:space="preserve">8</w:t>
                 </w:r>
               </w:sdtContent>
             </w:sdt>
@@ -6296,7 +6625,7 @@
                     <w:sz w:val="14"/>
                     <w:szCs w:val="14"/>
                   </w:rPr>
-                  <w:t xml:space="preserve">Select ▾</w:t>
+                  <w:t xml:space="preserve">5</w:t>
                 </w:r>
               </w:sdtContent>
             </w:sdt>
@@ -6328,7 +6657,7 @@
                     <w:sz w:val="14"/>
                     <w:szCs w:val="14"/>
                   </w:rPr>
-                  <w:t xml:space="preserve">type here</w:t>
+                  <w:t xml:space="preserve">360 (measured rate 28.0 %, baseline_fast, n=250)</w:t>
                 </w:r>
               </w:sdtContent>
             </w:sdt>
@@ -6360,7 +6689,7 @@
                     <w:sz w:val="14"/>
                     <w:szCs w:val="14"/>
                   </w:rPr>
-                  <w:t xml:space="preserve">type here</w:t>
+                  <w:t xml:space="preserve">FSM CURB_SIDEWALK speed cap from the measured kerb table and a dynamic-window planner that slows for the kerb</w:t>
                 </w:r>
               </w:sdtContent>
             </w:sdt>
@@ -6392,7 +6721,7 @@
                     <w:sz w:val="14"/>
                     <w:szCs w:val="14"/>
                   </w:rPr>
-                  <w:t xml:space="preserve">type here</w:t>
+                  <w:t xml:space="preserve">270 (O=6, D=5; measured rate 7.6 %, proposed, n=250)</w:t>
                 </w:r>
               </w:sdtContent>
             </w:sdt>
@@ -6430,7 +6759,7 @@
                     <w:sz w:val="14"/>
                     <w:szCs w:val="14"/>
                   </w:rPr>
-                  <w:t xml:space="preserve">Select ▾</w:t>
+                  <w:t xml:space="preserve">Both</w:t>
                 </w:r>
               </w:sdtContent>
             </w:sdt>
@@ -6468,7 +6797,7 @@
                     <w:sz w:val="14"/>
                     <w:szCs w:val="14"/>
                   </w:rPr>
-                  <w:t xml:space="preserve">type here</w:t>
+                  <w:t xml:space="preserve">Wheel slip or entrapment on a wet kerb</w:t>
                 </w:r>
               </w:sdtContent>
             </w:sdt>
@@ -6500,7 +6829,7 @@
                     <w:sz w:val="14"/>
                     <w:szCs w:val="14"/>
                   </w:rPr>
-                  <w:t xml:space="preserve">type here</w:t>
+                  <w:t xml:space="preserve">Late arrival or stranded pod: delayed first shock</w:t>
                 </w:r>
               </w:sdtContent>
             </w:sdt>
@@ -6544,7 +6873,7 @@
                     <w:sz w:val="14"/>
                     <w:szCs w:val="14"/>
                   </w:rPr>
-                  <w:t xml:space="preserve">Select ▾</w:t>
+                  <w:t xml:space="preserve">8</w:t>
                 </w:r>
               </w:sdtContent>
             </w:sdt>
@@ -6588,7 +6917,7 @@
                     <w:sz w:val="14"/>
                     <w:szCs w:val="14"/>
                   </w:rPr>
-                  <w:t xml:space="preserve">Select ▾</w:t>
+                  <w:t xml:space="preserve">10</w:t>
                 </w:r>
               </w:sdtContent>
             </w:sdt>
@@ -6632,7 +6961,7 @@
                     <w:sz w:val="14"/>
                     <w:szCs w:val="14"/>
                   </w:rPr>
-                  <w:t xml:space="preserve">Select ▾</w:t>
+                  <w:t xml:space="preserve">5</w:t>
                 </w:r>
               </w:sdtContent>
             </w:sdt>
@@ -6664,7 +6993,7 @@
                     <w:sz w:val="14"/>
                     <w:szCs w:val="14"/>
                   </w:rPr>
-                  <w:t xml:space="preserve">type here</w:t>
+                  <w:t xml:space="preserve">400 (measured rate 84.0 %, baseline_fast, n=50)</w:t>
                 </w:r>
               </w:sdtContent>
             </w:sdt>
@@ -6696,7 +7025,7 @@
                     <w:sz w:val="14"/>
                     <w:szCs w:val="14"/>
                   </w:rPr>
-                  <w:t xml:space="preserve">type here</w:t>
+                  <w:t xml:space="preserve">Climb speed from the kerb table at a conservative friction belief; planner replans around the obstruction</w:t>
                 </w:r>
               </w:sdtContent>
             </w:sdt>
@@ -6728,7 +7057,7 @@
                     <w:sz w:val="14"/>
                     <w:szCs w:val="14"/>
                   </w:rPr>
-                  <w:t xml:space="preserve">type here</w:t>
+                  <w:t xml:space="preserve">400 (O=10, D=5; measured rate 78.0 %, proposed, n=50)</w:t>
                 </w:r>
               </w:sdtContent>
             </w:sdt>
@@ -6766,7 +7095,7 @@
                     <w:sz w:val="14"/>
                     <w:szCs w:val="14"/>
                   </w:rPr>
-                  <w:t xml:space="preserve">Select ▾</w:t>
+                  <w:t xml:space="preserve">Both</w:t>
                 </w:r>
               </w:sdtContent>
             </w:sdt>
@@ -6804,7 +7133,7 @@
                     <w:sz w:val="14"/>
                     <w:szCs w:val="14"/>
                   </w:rPr>
-                  <w:t xml:space="preserve">type here</w:t>
+                  <w:t xml:space="preserve">Stall: no forward progress for 15 s</w:t>
                 </w:r>
               </w:sdtContent>
             </w:sdt>
@@ -6836,7 +7165,7 @@
                     <w:sz w:val="14"/>
                     <w:szCs w:val="14"/>
                   </w:rPr>
-                  <w:t xml:space="preserve">type here</w:t>
+                  <w:t xml:space="preserve">Mission aborted; ambulance remains the only response</w:t>
                 </w:r>
               </w:sdtContent>
             </w:sdt>
@@ -6880,7 +7209,7 @@
                     <w:sz w:val="14"/>
                     <w:szCs w:val="14"/>
                   </w:rPr>
-                  <w:t xml:space="preserve">Select ▾</w:t>
+                  <w:t xml:space="preserve">7</w:t>
                 </w:r>
               </w:sdtContent>
             </w:sdt>
@@ -6924,7 +7253,7 @@
                     <w:sz w:val="14"/>
                     <w:szCs w:val="14"/>
                   </w:rPr>
-                  <w:t xml:space="preserve">Select ▾</w:t>
+                  <w:t xml:space="preserve">9</w:t>
                 </w:r>
               </w:sdtContent>
             </w:sdt>
@@ -6968,7 +7297,7 @@
                     <w:sz w:val="14"/>
                     <w:szCs w:val="14"/>
                   </w:rPr>
-                  <w:t xml:space="preserve">Select ▾</w:t>
+                  <w:t xml:space="preserve">4</w:t>
                 </w:r>
               </w:sdtContent>
             </w:sdt>
@@ -7000,7 +7329,7 @@
                     <w:sz w:val="14"/>
                     <w:szCs w:val="14"/>
                   </w:rPr>
-                  <w:t xml:space="preserve">type here</w:t>
+                  <w:t xml:space="preserve">252 (measured rate 43.2 %, baseline_fast, n=250)</w:t>
                 </w:r>
               </w:sdtContent>
             </w:sdt>
@@ -7032,7 +7361,7 @@
                     <w:sz w:val="14"/>
                     <w:szCs w:val="14"/>
                   </w:rPr>
-                  <w:t xml:space="preserve">type here</w:t>
+                  <w:t xml:space="preserve">Dynamic-window planner replaces constant-speed pure pursuit; FSM keeps a creep speed in every state</w:t>
                 </w:r>
               </w:sdtContent>
             </w:sdt>
@@ -7064,7 +7393,7 @@
                     <w:sz w:val="14"/>
                     <w:szCs w:val="14"/>
                   </w:rPr>
-                  <w:t xml:space="preserve">type here</w:t>
+                  <w:t xml:space="preserve">196 (O=7, D=4; measured rate 16.4 %, proposed, n=250)</w:t>
                 </w:r>
               </w:sdtContent>
             </w:sdt>
@@ -7102,7 +7431,7 @@
                     <w:sz w:val="14"/>
                     <w:szCs w:val="14"/>
                   </w:rPr>
-                  <w:t xml:space="preserve">Select ▾</w:t>
+                  <w:t xml:space="preserve">Simulation</w:t>
                 </w:r>
               </w:sdtContent>
             </w:sdt>
@@ -7139,7 +7468,7 @@
                     <w:sz w:val="14"/>
                     <w:szCs w:val="14"/>
                   </w:rPr>
-                  <w:t xml:space="preserve">type here</w:t>
+                  <w:t xml:space="preserve">Rollover on an oblique kerb approach</w:t>
                 </w:r>
               </w:sdtContent>
             </w:sdt>
@@ -7170,7 +7499,7 @@
                     <w:sz w:val="14"/>
                     <w:szCs w:val="14"/>
                   </w:rPr>
-                  <w:t xml:space="preserve">type here</w:t>
+                  <w:t xml:space="preserve">Loss of vehicle and payload, possible injury</w:t>
                 </w:r>
               </w:sdtContent>
             </w:sdt>
@@ -7213,7 +7542,7 @@
                     <w:sz w:val="14"/>
                     <w:szCs w:val="14"/>
                   </w:rPr>
-                  <w:t xml:space="preserve">Select ▾</w:t>
+                  <w:t xml:space="preserve">10</w:t>
                 </w:r>
               </w:sdtContent>
             </w:sdt>
@@ -7256,7 +7585,7 @@
                     <w:sz w:val="14"/>
                     <w:szCs w:val="14"/>
                   </w:rPr>
-                  <w:t xml:space="preserve">Select ▾</w:t>
+                  <w:t xml:space="preserve">1</w:t>
                 </w:r>
               </w:sdtContent>
             </w:sdt>
@@ -7299,7 +7628,7 @@
                     <w:sz w:val="14"/>
                     <w:szCs w:val="14"/>
                   </w:rPr>
-                  <w:t xml:space="preserve">Select ▾</w:t>
+                  <w:t xml:space="preserve">5</w:t>
                 </w:r>
               </w:sdtContent>
             </w:sdt>
@@ -7330,7 +7659,7 @@
                     <w:sz w:val="14"/>
                     <w:szCs w:val="14"/>
                   </w:rPr>
-                  <w:t xml:space="preserve">type here</w:t>
+                  <w:t xml:space="preserve">50 (measured rate 0.0 %, baseline_fast, n=250)</w:t>
                 </w:r>
               </w:sdtContent>
             </w:sdt>
@@ -7361,7 +7690,7 @@
                     <w:sz w:val="14"/>
                     <w:szCs w:val="14"/>
                   </w:rPr>
-                  <w:t xml:space="preserve">type here</w:t>
+                  <w:t xml:space="preserve">Roll-limit monitored as the stability index (18 deg); speed cap in CURB_SIDEWALK</w:t>
                 </w:r>
               </w:sdtContent>
             </w:sdt>
@@ -7392,7 +7721,7 @@
                     <w:sz w:val="14"/>
                     <w:szCs w:val="14"/>
                   </w:rPr>
-                  <w:t xml:space="preserve">type here</w:t>
+                  <w:t xml:space="preserve">50 (O=1, D=5; measured rate 0.0 %, proposed, n=250)</w:t>
                 </w:r>
               </w:sdtContent>
             </w:sdt>
@@ -7429,7 +7758,7 @@
                     <w:sz w:val="14"/>
                     <w:szCs w:val="14"/>
                   </w:rPr>
-                  <w:t xml:space="preserve">Select ▾</w:t>
+                  <w:t xml:space="preserve">Simulation</w:t>
                 </w:r>
               </w:sdtContent>
             </w:sdt>
@@ -7469,15 +7798,39 @@
               <w:spacing w:after="0"/>
               <w:jc w:val="center"/>
             </w:pPr>
-            <w:r/>
             <w:r>
-              <w:rPr>
-                <w:b w:val="0"/>
-                <w:i/>
-                <w:color w:val="595959"/>
-                <w:sz w:val="15"/>
-              </w:rPr>
-              <w:t>[ Sensitivity graph: P_payback / NCRI vs the uncertain input ]</w:t>
+              <w:drawing>
+                <wp:inline xmlns:a="http://schemas.openxmlformats.org/drawingml/2006/main" xmlns:pic="http://schemas.openxmlformats.org/drawingml/2006/picture">
+                  <wp:extent cx="5303520" cy="2238085"/>
+                  <wp:docPr id="1" name="Picture 1"/>
+                  <wp:cNvGraphicFramePr>
+                    <a:graphicFrameLocks noChangeAspect="1"/>
+                  </wp:cNvGraphicFramePr>
+                  <a:graphic>
+                    <a:graphicData uri="http://schemas.openxmlformats.org/drawingml/2006/picture">
+                      <pic:pic>
+                        <pic:nvPicPr>
+                          <pic:cNvPr id="0" name="business_sensitivity.png"/>
+                          <pic:cNvPicPr/>
+                        </pic:nvPicPr>
+                        <pic:blipFill>
+                          <a:blip r:embed="rId10"/>
+                          <a:stretch>
+                            <a:fillRect/>
+                          </a:stretch>
+                        </pic:blipFill>
+                        <pic:spPr>
+                          <a:xfrm>
+                            <a:off x="0" y="0"/>
+                            <a:ext cx="5303520" cy="2238085"/>
+                          </a:xfrm>
+                          <a:prstGeom prst="rect"/>
+                        </pic:spPr>
+                      </pic:pic>
+                    </a:graphicData>
+                  </a:graphic>
+                </wp:inline>
+              </w:drawing>
             </w:r>
           </w:p>
         </w:tc>
@@ -7491,15 +7844,39 @@
               <w:spacing w:after="0"/>
               <w:jc w:val="center"/>
             </w:pPr>
-            <w:r/>
             <w:r>
-              <w:rPr>
-                <w:b w:val="0"/>
-                <w:i/>
-                <w:color w:val="595959"/>
-                <w:sz w:val="15"/>
-              </w:rPr>
-              <w:t>[ Queuing graph: W_q vs utilisation ρ, or labour-reallocation chart ]</w:t>
+              <w:drawing>
+                <wp:inline xmlns:a="http://schemas.openxmlformats.org/drawingml/2006/main" xmlns:pic="http://schemas.openxmlformats.org/drawingml/2006/picture">
+                  <wp:extent cx="5303520" cy="3875105"/>
+                  <wp:docPr id="2" name="Picture 2"/>
+                  <wp:cNvGraphicFramePr>
+                    <a:graphicFrameLocks noChangeAspect="1"/>
+                  </wp:cNvGraphicFramePr>
+                  <a:graphic>
+                    <a:graphicData uri="http://schemas.openxmlformats.org/drawingml/2006/picture">
+                      <pic:pic>
+                        <pic:nvPicPr>
+                          <pic:cNvPr id="0" name="business_queue.png"/>
+                          <pic:cNvPicPr/>
+                        </pic:nvPicPr>
+                        <pic:blipFill>
+                          <a:blip r:embed="rId11"/>
+                          <a:stretch>
+                            <a:fillRect/>
+                          </a:stretch>
+                        </pic:blipFill>
+                        <pic:spPr>
+                          <a:xfrm>
+                            <a:off x="0" y="0"/>
+                            <a:ext cx="5303520" cy="3875105"/>
+                          </a:xfrm>
+                          <a:prstGeom prst="rect"/>
+                        </pic:spPr>
+                      </pic:pic>
+                    </a:graphicData>
+                  </a:graphic>
+                </wp:inline>
+              </w:drawing>
             </w:r>
           </w:p>
         </w:tc>
@@ -7953,7 +8330,7 @@
                     <w:sz w:val="15"/>
                     <w:szCs w:val="15"/>
                   </w:rPr>
-                  <w:t xml:space="preserve">type here</w:t>
+                  <w:t xml:space="preserve">Pure pursuit at constant 1.4 m/s + the same safety filter ('baseline'), on the same course vehicle. FMEA references: the unfiltered run ('baseline_unshielded') and pure pursuit at the 3.5 m/s cruise speed ('baseline_fast')</w:t>
                 </w:r>
               </w:sdtContent>
             </w:sdt>
@@ -8012,7 +8389,7 @@
                     <w:sz w:val="15"/>
                     <w:szCs w:val="15"/>
                   </w:rPr>
-                  <w:t xml:space="preserve">type here</w:t>
+                  <w:t xml:space="preserve">50 per condition and controller, 5 conditions (1250 episodes); protocol pool n=150 per controller</w:t>
                 </w:r>
               </w:sdtContent>
             </w:sdt>
@@ -8071,7 +8448,7 @@
                     <w:sz w:val="15"/>
                     <w:szCs w:val="15"/>
                   </w:rPr>
-                  <w:t xml:space="preserve">type here</w:t>
+                  <w:t xml:space="preserve">per seed: kerb height U(0.09, 0.15) m, tyre friction U(0.7, 1.1) (slippery: U(0.35, 0.6)), payload mass U(3, 5) kg, obstacle and pedestrian layout and speeds, sensor noise (sim/scenario.py); conditions: free_flow, lane_splitting, crowd (protocol) + kerb, slippery (stress)</w:t>
                 </w:r>
               </w:sdtContent>
             </w:sdt>
@@ -8130,7 +8507,7 @@
                     <w:sz w:val="15"/>
                     <w:szCs w:val="15"/>
                   </w:rPr>
-                  <w:t xml:space="preserve">type here</w:t>
+                  <w:t xml:space="preserve">500.0 Hz (min 500.0, max 500.0)</w:t>
                 </w:r>
               </w:sdtContent>
             </w:sdt>
@@ -8193,7 +8570,7 @@
                     <w:sz w:val="15"/>
                     <w:szCs w:val="15"/>
                   </w:rPr>
-                  <w:t xml:space="preserve">Select ▾</w:t>
+                  <w:t xml:space="preserve">Yes</w:t>
                 </w:r>
               </w:sdtContent>
             </w:sdt>
@@ -8250,7 +8627,7 @@
                     <w:sz w:val="15"/>
                     <w:szCs w:val="15"/>
                   </w:rPr>
-                  <w:t xml:space="preserve">type here</w:t>
+                  <w:t xml:space="preserve">Group_03_Kashish_Vaishnavi/analytics/aed_delivery_real_trials.csv</w:t>
                 </w:r>
               </w:sdtContent>
             </w:sdt>
@@ -8467,7 +8844,7 @@
                     <w:sz w:val="15"/>
                     <w:szCs w:val="15"/>
                   </w:rPr>
-                  <w:t xml:space="preserve">type here</w:t>
+                  <w:t xml:space="preserve">68 / 115 successful of 150 runs each</w:t>
                 </w:r>
               </w:sdtContent>
             </w:sdt>
@@ -8499,7 +8876,7 @@
                     <w:sz w:val="15"/>
                     <w:szCs w:val="15"/>
                   </w:rPr>
-                  <w:t xml:space="preserve">type here</w:t>
+                  <w:t xml:space="preserve">0.0232 +/- 0.0128</w:t>
                 </w:r>
               </w:sdtContent>
             </w:sdt>
@@ -8531,7 +8908,7 @@
                     <w:sz w:val="15"/>
                     <w:szCs w:val="15"/>
                   </w:rPr>
-                  <w:t xml:space="preserve">type here</w:t>
+                  <w:t xml:space="preserve">0.809 +/- 0.336</w:t>
                 </w:r>
               </w:sdtContent>
             </w:sdt>
@@ -8563,7 +8940,7 @@
                     <w:sz w:val="15"/>
                     <w:szCs w:val="15"/>
                   </w:rPr>
-                  <w:t xml:space="preserve">type here</w:t>
+                  <w:t xml:space="preserve">m</w:t>
                 </w:r>
               </w:sdtContent>
             </w:sdt>
@@ -8599,7 +8976,7 @@
                     <w:sz w:val="14"/>
                     <w:szCs w:val="14"/>
                   </w:rPr>
-                  <w:t xml:space="preserve">Select ▾</w:t>
+                  <w:t xml:space="preserve">Lower is better</w:t>
                 </w:r>
               </w:sdtContent>
             </w:sdt>
@@ -8657,7 +9034,7 @@
                     <w:sz w:val="15"/>
                     <w:szCs w:val="15"/>
                   </w:rPr>
-                  <w:t xml:space="preserve">type here</w:t>
+                  <w:t xml:space="preserve">68 / 115 successful of 150 runs each</w:t>
                 </w:r>
               </w:sdtContent>
             </w:sdt>
@@ -8689,7 +9066,7 @@
                     <w:sz w:val="15"/>
                     <w:szCs w:val="15"/>
                   </w:rPr>
-                  <w:t xml:space="preserve">type here</w:t>
+                  <w:t xml:space="preserve">928.1 +/- 1785</w:t>
                 </w:r>
               </w:sdtContent>
             </w:sdt>
@@ -8721,7 +9098,7 @@
                     <w:sz w:val="15"/>
                     <w:szCs w:val="15"/>
                   </w:rPr>
-                  <w:t xml:space="preserve">type here</w:t>
+                  <w:t xml:space="preserve">5613 +/- 7162</w:t>
                 </w:r>
               </w:sdtContent>
             </w:sdt>
@@ -8753,7 +9130,7 @@
                     <w:sz w:val="15"/>
                     <w:szCs w:val="15"/>
                   </w:rPr>
-                  <w:t xml:space="preserve">type here</w:t>
+                  <w:t xml:space="preserve">N^2 m^2 s</w:t>
                 </w:r>
               </w:sdtContent>
             </w:sdt>
@@ -8789,7 +9166,7 @@
                     <w:sz w:val="14"/>
                     <w:szCs w:val="14"/>
                   </w:rPr>
-                  <w:t xml:space="preserve">Select ▾</w:t>
+                  <w:t xml:space="preserve">Lower is better</w:t>
                 </w:r>
               </w:sdtContent>
             </w:sdt>
@@ -8825,7 +9202,7 @@
                     <w:sz w:val="15"/>
                     <w:szCs w:val="15"/>
                   </w:rPr>
-                  <w:t xml:space="preserve">type here</w:t>
+                  <w:t xml:space="preserve">Time to first shock (TTFS, from collapse)</w:t>
                 </w:r>
               </w:sdtContent>
             </w:sdt>
@@ -8856,7 +9233,7 @@
                     <w:sz w:val="15"/>
                     <w:szCs w:val="15"/>
                   </w:rPr>
-                  <w:t xml:space="preserve">type here</w:t>
+                  <w:t xml:space="preserve">68 / 115 successful of 150 runs each</w:t>
                 </w:r>
               </w:sdtContent>
             </w:sdt>
@@ -8887,7 +9264,7 @@
                     <w:sz w:val="15"/>
                     <w:szCs w:val="15"/>
                   </w:rPr>
-                  <w:t xml:space="preserve">type here</w:t>
+                  <w:t xml:space="preserve">13.8 +/- 2.72</w:t>
                 </w:r>
               </w:sdtContent>
             </w:sdt>
@@ -8918,7 +9295,7 @@
                     <w:sz w:val="15"/>
                     <w:szCs w:val="15"/>
                   </w:rPr>
-                  <w:t xml:space="preserve">type here</w:t>
+                  <w:t xml:space="preserve">10.4 +/- 2.7</w:t>
                 </w:r>
               </w:sdtContent>
             </w:sdt>
@@ -8949,7 +9326,7 @@
                     <w:sz w:val="15"/>
                     <w:szCs w:val="15"/>
                   </w:rPr>
-                  <w:t xml:space="preserve">type here</w:t>
+                  <w:t xml:space="preserve">min</w:t>
                 </w:r>
               </w:sdtContent>
             </w:sdt>
@@ -8984,7 +9361,7 @@
                     <w:sz w:val="14"/>
                     <w:szCs w:val="14"/>
                   </w:rPr>
-                  <w:t xml:space="preserve">Select ▾</w:t>
+                  <w:t xml:space="preserve">Lower is better</w:t>
                 </w:r>
               </w:sdtContent>
             </w:sdt>
@@ -9067,7 +9444,7 @@
                     <w:sz w:val="15"/>
                     <w:szCs w:val="15"/>
                   </w:rPr>
-                  <w:t xml:space="preserve">Select ▾</w:t>
+                  <w:t xml:space="preserve">Welch's t-test</w:t>
                 </w:r>
               </w:sdtContent>
             </w:sdt>
@@ -9126,7 +9503,7 @@
                     <w:sz w:val="15"/>
                     <w:szCs w:val="15"/>
                   </w:rPr>
-                  <w:t xml:space="preserve">type here</w:t>
+                  <w:t xml:space="preserve">t = 8.160, df = 140.0, p = 1.74e-13 (successful runs, protocol conditions pooled)</w:t>
                 </w:r>
               </w:sdtContent>
             </w:sdt>
@@ -9185,7 +9562,7 @@
                     <w:sz w:val="15"/>
                     <w:szCs w:val="15"/>
                   </w:rPr>
-                  <w:t xml:space="preserve">type here</w:t>
+                  <w:t xml:space="preserve">d = 1.250</w:t>
                 </w:r>
               </w:sdtContent>
             </w:sdt>
@@ -9242,7 +9619,7 @@
                     <w:sz w:val="15"/>
                     <w:szCs w:val="15"/>
                   </w:rPr>
-                  <w:t xml:space="preserve">type here</w:t>
+                  <w:t xml:space="preserve">[2.567, 4.208] min (baseline - proposed)</w:t>
                 </w:r>
               </w:sdtContent>
             </w:sdt>
@@ -9282,15 +9659,39 @@
               <w:spacing w:after="0"/>
               <w:jc w:val="center"/>
             </w:pPr>
-            <w:r/>
             <w:r>
-              <w:rPr>
-                <w:b w:val="0"/>
-                <w:i/>
-                <w:color w:val="595959"/>
-                <w:sz w:val="15"/>
-              </w:rPr>
-              <w:t>[ Trajectory plot: reference vs actual, one representative run ]</w:t>
+              <w:drawing>
+                <wp:inline xmlns:a="http://schemas.openxmlformats.org/drawingml/2006/main" xmlns:pic="http://schemas.openxmlformats.org/drawingml/2006/picture">
+                  <wp:extent cx="5303520" cy="3938748"/>
+                  <wp:docPr id="3" name="Picture 3"/>
+                  <wp:cNvGraphicFramePr>
+                    <a:graphicFrameLocks noChangeAspect="1"/>
+                  </wp:cNvGraphicFramePr>
+                  <a:graphic>
+                    <a:graphicData uri="http://schemas.openxmlformats.org/drawingml/2006/picture">
+                      <pic:pic>
+                        <pic:nvPicPr>
+                          <pic:cNvPr id="0" name="capstone_trajectory.png"/>
+                          <pic:cNvPicPr/>
+                        </pic:nvPicPr>
+                        <pic:blipFill>
+                          <a:blip r:embed="rId12"/>
+                          <a:stretch>
+                            <a:fillRect/>
+                          </a:stretch>
+                        </pic:blipFill>
+                        <pic:spPr>
+                          <a:xfrm>
+                            <a:off x="0" y="0"/>
+                            <a:ext cx="5303520" cy="3938748"/>
+                          </a:xfrm>
+                          <a:prstGeom prst="rect"/>
+                        </pic:spPr>
+                      </pic:pic>
+                    </a:graphicData>
+                  </a:graphic>
+                </wp:inline>
+              </w:drawing>
             </w:r>
           </w:p>
         </w:tc>
@@ -9304,15 +9705,39 @@
               <w:spacing w:after="0"/>
               <w:jc w:val="center"/>
             </w:pPr>
-            <w:r/>
             <w:r>
-              <w:rPr>
-                <w:b w:val="0"/>
-                <w:i/>
-                <w:color w:val="595959"/>
-                <w:sz w:val="15"/>
-              </w:rPr>
-              <w:t>[ Box-plot of the primary metric: baseline vs proposed, N runs each ]</w:t>
+              <w:drawing>
+                <wp:inline xmlns:a="http://schemas.openxmlformats.org/drawingml/2006/main" xmlns:pic="http://schemas.openxmlformats.org/drawingml/2006/picture">
+                  <wp:extent cx="5303520" cy="4611757"/>
+                  <wp:docPr id="4" name="Picture 4"/>
+                  <wp:cNvGraphicFramePr>
+                    <a:graphicFrameLocks noChangeAspect="1"/>
+                  </wp:cNvGraphicFramePr>
+                  <a:graphic>
+                    <a:graphicData uri="http://schemas.openxmlformats.org/drawingml/2006/picture">
+                      <pic:pic>
+                        <pic:nvPicPr>
+                          <pic:cNvPr id="0" name="capstone_ttfs_boxplot.png"/>
+                          <pic:cNvPicPr/>
+                        </pic:nvPicPr>
+                        <pic:blipFill>
+                          <a:blip r:embed="rId13"/>
+                          <a:stretch>
+                            <a:fillRect/>
+                          </a:stretch>
+                        </pic:blipFill>
+                        <pic:spPr>
+                          <a:xfrm>
+                            <a:off x="0" y="0"/>
+                            <a:ext cx="5303520" cy="4611757"/>
+                          </a:xfrm>
+                          <a:prstGeom prst="rect"/>
+                        </pic:spPr>
+                      </pic:pic>
+                    </a:graphicData>
+                  </a:graphic>
+                </wp:inline>
+              </w:drawing>
             </w:r>
           </w:p>
         </w:tc>
@@ -9406,7 +9831,7 @@
                     <w:sz w:val="15"/>
                     <w:szCs w:val="15"/>
                   </w:rPr>
-                  <w:t xml:space="preserve">Select ▾</w:t>
+                  <w:t xml:space="preserve">Yes</w:t>
                 </w:r>
               </w:sdtContent>
             </w:sdt>
@@ -9469,7 +9894,7 @@
                     <w:sz w:val="15"/>
                     <w:szCs w:val="15"/>
                   </w:rPr>
-                  <w:t xml:space="preserve">Select ▾</w:t>
+                  <w:t xml:space="preserve">Yes</w:t>
                 </w:r>
               </w:sdtContent>
             </w:sdt>
@@ -9532,7 +9957,7 @@
                     <w:sz w:val="15"/>
                     <w:szCs w:val="15"/>
                   </w:rPr>
-                  <w:t xml:space="preserve">Select ▾</w:t>
+                  <w:t xml:space="preserve">Yes</w:t>
                 </w:r>
               </w:sdtContent>
             </w:sdt>
@@ -9593,7 +10018,7 @@
                     <w:sz w:val="15"/>
                     <w:szCs w:val="15"/>
                   </w:rPr>
-                  <w:t xml:space="preserve">Select ▾</w:t>
+                  <w:t xml:space="preserve">Yes</w:t>
                 </w:r>
               </w:sdtContent>
             </w:sdt>

</xml_diff>

<commit_message>
docs(group-03): sync remaining results, scenarios and documents with the final run
Co-Authored-By: Claude Sonnet 5.5 <noreply@anthropic.com>
</commit_message>
<xml_diff>
--- a/Group_03_Kashish_Vaishnavi/docs/MDRIIA_Group_03_Technical_Dossier.docx
+++ b/Group_03_Kashish_Vaishnavi/docs/MDRIIA_Group_03_Technical_Dossier.docx
@@ -1929,7 +1929,7 @@
                     <w:sz w:val="14"/>
                     <w:szCs w:val="14"/>
                   </w:rPr>
-                  <w:t xml:space="preserve">Braking distance s = v^2/(2 mu g) + v t_detect, FOV &gt;= 180 deg, 1.5 m / 0.4 m zones (course manual 2.2). MET: s = 0.26 m at 1.8 m/s, mu = 1.0, t_detect = 50 ms Detection latency: DEVIATION: 100 ms modelled reaction time in the safety filter</w:t>
+                  <w:t xml:space="preserve">Braking distance s = v^2/(2 mu g) + v t_detect, FOV &gt;= 180 deg, 1.5 m / 0.4 m zones (course manual 2.2). MET: s = 0.26 m at 1.8 m/s, mu = 1.0, t_detect = 50 ms Detection latency: MET: 50 ms modelled reaction time in the safety filter</w:t>
                 </w:r>
               </w:sdtContent>
             </w:sdt>
@@ -2203,7 +2203,7 @@
                     <w:sz w:val="14"/>
                     <w:szCs w:val="14"/>
                   </w:rPr>
-                  <w:t xml:space="preserve">The AED is the medical device; the pod only protects it from shock (budget 3 g). On the course vehicle at 3.5 m/s cruise, 250 runs: 92 % stay within 3 g, worst 4.62 g (deviation recorded).</w:t>
+                  <w:t xml:space="preserve">The AED is the medical device; the pod only protects it from shock (budget 3 g). On the course vehicle at 3.5 m/s cruise, 250 runs: 96 % stay within 3 g, worst 3.44 g (deviation recorded).</w:t>
                 </w:r>
               </w:sdtContent>
             </w:sdt>
@@ -3248,7 +3248,7 @@
                     <w:sz w:val="15"/>
                     <w:szCs w:val="15"/>
                   </w:rPr>
-                  <w:t xml:space="preserve">DWA scoring weights: progress 1.0, centring 0.5, speed 1.0, clearance 1.2, heading 0.2; horizon 2.4 s, dt 0.15 s, a_max 1.6 m/s^2, a_brake 2.0 m/s^2; FSM caps: ROAD_CRUISE 3.5 m/s (the guide's value), CURB_SIDEWALK &gt;= 1.2 m/s, launch 1.0 m/s^2, brake 1.5 m/s^2</w:t>
+                  <w:t xml:space="preserve">DWA scoring weights: progress 1.0, centring 0.5, speed 1.0, clearance 1.2, heading 0.2; horizon 2.4 s, dt 0.15 s, a_max 1.6 m/s^2, a_brake 2.0 m/s^2; FSM caps: ROAD_CRUISE 3.5 m/s (the guide's value), CURB_SIDEWALK &gt;= 1.2 m/s, launch 1.0 m/s^2, brake 1.5 m/s^2; kerb friction belief 0.35 and safety-filter reaction time 0.05 s, both chosen on tuning seeds 60000+ (the evaluation seeds start at 70000)</w:t>
                 </w:r>
               </w:sdtContent>
             </w:sdt>
@@ -5450,7 +5450,7 @@
                     <w:sz w:val="14"/>
                     <w:szCs w:val="14"/>
                   </w:rPr>
-                  <w:t xml:space="preserve">lambda 0.00204/h per hub, mu 2.19/h (service 27.5 min = round trip at measured 2.06 m/s + 0.25 h turnaround), c 1</w:t>
+                  <w:t xml:space="preserve">lambda 0.00204/h per hub, mu 2.17/h (service 27.6 min = round trip at measured 2.03 m/s + 0.25 h turnaround), c 1</w:t>
                 </w:r>
               </w:sdtContent>
             </w:sdt>
@@ -5482,7 +5482,7 @@
                     <w:sz w:val="14"/>
                     <w:szCs w:val="14"/>
                   </w:rPr>
-                  <w:t xml:space="preserve">rho = 0.000933; P(wait) = 0.000933; W_q = 0.0256 min</w:t>
+                  <w:t xml:space="preserve">rho = 0.000939; P(wait) = 0.000939; W_q = 0.026 min</w:t>
                 </w:r>
               </w:sdtContent>
             </w:sdt>
@@ -5731,7 +5731,7 @@
                     <w:sz w:val="15"/>
                     <w:szCs w:val="15"/>
                   </w:rPr>
-                  <w:t xml:space="preserve">lambda = 0.00204 /h, mu = 2.19 /h, c = 1 per hub</w:t>
+                  <w:t xml:space="preserve">lambda = 0.00204 /h, mu = 2.17 /h, c = 1 per hub</w:t>
                 </w:r>
               </w:sdtContent>
             </w:sdt>
@@ -6396,7 +6396,7 @@
                     <w:sz w:val="14"/>
                     <w:szCs w:val="14"/>
                   </w:rPr>
-                  <w:t xml:space="preserve">162 (O=6, D=3; measured rate 7.6 %, proposed, n=250)</w:t>
+                  <w:t xml:space="preserve">162 (O=6, D=3; measured rate 5.6 %, proposed, n=250)</w:t>
                 </w:r>
               </w:sdtContent>
             </w:sdt>
@@ -6721,7 +6721,7 @@
                     <w:sz w:val="14"/>
                     <w:szCs w:val="14"/>
                   </w:rPr>
-                  <w:t xml:space="preserve">270 (O=6, D=5; measured rate 7.6 %, proposed, n=250)</w:t>
+                  <w:t xml:space="preserve">225 (O=5, D=5; measured rate 3.6 %, proposed, n=250)</w:t>
                 </w:r>
               </w:sdtContent>
             </w:sdt>
@@ -7057,7 +7057,7 @@
                     <w:sz w:val="14"/>
                     <w:szCs w:val="14"/>
                   </w:rPr>
-                  <w:t xml:space="preserve">400 (O=10, D=5; measured rate 78.0 %, proposed, n=50)</w:t>
+                  <w:t xml:space="preserve">400 (O=10, D=5; measured rate 76.0 %, proposed, n=50)</w:t>
                 </w:r>
               </w:sdtContent>
             </w:sdt>
@@ -7393,7 +7393,7 @@
                     <w:sz w:val="14"/>
                     <w:szCs w:val="14"/>
                   </w:rPr>
-                  <w:t xml:space="preserve">196 (O=7, D=4; measured rate 16.4 %, proposed, n=250)</w:t>
+                  <w:t xml:space="preserve">196 (O=7, D=4; measured rate 19.2 %, proposed, n=250)</w:t>
                 </w:r>
               </w:sdtContent>
             </w:sdt>
@@ -8844,7 +8844,7 @@
                     <w:sz w:val="15"/>
                     <w:szCs w:val="15"/>
                   </w:rPr>
-                  <w:t xml:space="preserve">68 / 115 successful of 150 runs each</w:t>
+                  <w:t xml:space="preserve">68 / 116 successful of 150 runs each</w:t>
                 </w:r>
               </w:sdtContent>
             </w:sdt>
@@ -8908,7 +8908,7 @@
                     <w:sz w:val="15"/>
                     <w:szCs w:val="15"/>
                   </w:rPr>
-                  <w:t xml:space="preserve">0.809 +/- 0.336</w:t>
+                  <w:t xml:space="preserve">0.808 +/- 0.33</w:t>
                 </w:r>
               </w:sdtContent>
             </w:sdt>
@@ -9034,7 +9034,7 @@
                     <w:sz w:val="15"/>
                     <w:szCs w:val="15"/>
                   </w:rPr>
-                  <w:t xml:space="preserve">68 / 115 successful of 150 runs each</w:t>
+                  <w:t xml:space="preserve">68 / 116 successful of 150 runs each</w:t>
                 </w:r>
               </w:sdtContent>
             </w:sdt>
@@ -9098,7 +9098,7 @@
                     <w:sz w:val="15"/>
                     <w:szCs w:val="15"/>
                   </w:rPr>
-                  <w:t xml:space="preserve">5613 +/- 7162</w:t>
+                  <w:t xml:space="preserve">5381 +/- 6455</w:t>
                 </w:r>
               </w:sdtContent>
             </w:sdt>
@@ -9233,7 +9233,7 @@
                     <w:sz w:val="15"/>
                     <w:szCs w:val="15"/>
                   </w:rPr>
-                  <w:t xml:space="preserve">68 / 115 successful of 150 runs each</w:t>
+                  <w:t xml:space="preserve">68 / 116 successful of 150 runs each</w:t>
                 </w:r>
               </w:sdtContent>
             </w:sdt>
@@ -9295,7 +9295,7 @@
                     <w:sz w:val="15"/>
                     <w:szCs w:val="15"/>
                   </w:rPr>
-                  <w:t xml:space="preserve">10.4 +/- 2.7</w:t>
+                  <w:t xml:space="preserve">10.5 +/- 2.79</w:t>
                 </w:r>
               </w:sdtContent>
             </w:sdt>
@@ -9503,7 +9503,7 @@
                     <w:sz w:val="15"/>
                     <w:szCs w:val="15"/>
                   </w:rPr>
-                  <w:t xml:space="preserve">t = 8.160, df = 140.0, p = 1.74e-13 (successful runs, protocol conditions pooled)</w:t>
+                  <w:t xml:space="preserve">t = 7.945, df = 143.4, p = 5.19e-13 (successful runs, protocol conditions pooled)</w:t>
                 </w:r>
               </w:sdtContent>
             </w:sdt>
@@ -9562,7 +9562,7 @@
                     <w:sz w:val="15"/>
                     <w:szCs w:val="15"/>
                   </w:rPr>
-                  <w:t xml:space="preserve">d = 1.250</w:t>
+                  <w:t xml:space="preserve">d = 1.205</w:t>
                 </w:r>
               </w:sdtContent>
             </w:sdt>
@@ -9619,7 +9619,7 @@
                     <w:sz w:val="15"/>
                     <w:szCs w:val="15"/>
                   </w:rPr>
-                  <w:t xml:space="preserve">[2.567, 4.208] min (baseline - proposed)</w:t>
+                  <w:t xml:space="preserve">[2.504, 4.162] min (baseline - proposed)</w:t>
                 </w:r>
               </w:sdtContent>
             </w:sdt>

</xml_diff>

<commit_message>
docs(group-03): dossier docx with research-consent answers, matching the submitted pdf
Co-Authored-By: Claude Sonnet 5.5 <noreply@anthropic.com>
</commit_message>
<xml_diff>
--- a/Group_03_Kashish_Vaishnavi/docs/MDRIIA_Group_03_Technical_Dossier.docx
+++ b/Group_03_Kashish_Vaishnavi/docs/MDRIIA_Group_03_Technical_Dossier.docx
@@ -1286,6 +1286,7 @@
         <w:rPr>
           <w:b/>
         </w:rPr>
+        <w:lastRenderedPageBreak/>
         <w:t>1.2 Governing industry standards</w:t>
       </w:r>
     </w:p>
@@ -2227,7 +2228,6 @@
           <w:b/>
           <w:sz w:val="22"/>
         </w:rPr>
-        <w:lastRenderedPageBreak/>
         <w:t>SECTION 2 · MuJoCo Rigid-Body Physics Modelling &amp; Python Closed-Loop Control</w:t>
       </w:r>
       <w:r>
@@ -3765,7 +3765,7 @@
       <w:tr>
         <w:trPr>
           <w:cantSplit/>
-          <w:trHeight w:hRule="atLeast" w:val="2608"/>
+          <w:trHeight w:val="2608"/>
           <w:jc w:val="center"/>
         </w:trPr>
         <w:tc>
@@ -3773,9 +3773,6 @@
             <w:tcW w:w="10205" w:type="dxa"/>
           </w:tcPr>
           <w:p>
-            <w:pPr>
-              <w:jc w:val="left"/>
-            </w:pPr>
             <w:r>
               <w:rPr>
                 <w:rFonts w:ascii="Consolas" w:hAnsi="Consolas"/>
@@ -3785,9 +3782,6 @@
             </w:r>
           </w:p>
           <w:p>
-            <w:pPr>
-              <w:jc w:val="left"/>
-            </w:pPr>
             <w:r>
               <w:rPr>
                 <w:rFonts w:ascii="Consolas" w:hAnsi="Consolas"/>
@@ -3797,9 +3791,6 @@
             </w:r>
           </w:p>
           <w:p>
-            <w:pPr>
-              <w:jc w:val="left"/>
-            </w:pPr>
             <w:r>
               <w:rPr>
                 <w:rFonts w:ascii="Consolas" w:hAnsi="Consolas"/>
@@ -3809,9 +3800,6 @@
             </w:r>
           </w:p>
           <w:p>
-            <w:pPr>
-              <w:jc w:val="left"/>
-            </w:pPr>
             <w:r>
               <w:rPr>
                 <w:rFonts w:ascii="Consolas" w:hAnsi="Consolas"/>
@@ -3821,9 +3809,6 @@
             </w:r>
           </w:p>
           <w:p>
-            <w:pPr>
-              <w:jc w:val="left"/>
-            </w:pPr>
             <w:r>
               <w:rPr>
                 <w:rFonts w:ascii="Consolas" w:hAnsi="Consolas"/>
@@ -3833,9 +3818,6 @@
             </w:r>
           </w:p>
           <w:p>
-            <w:pPr>
-              <w:jc w:val="left"/>
-            </w:pPr>
             <w:r>
               <w:rPr>
                 <w:rFonts w:ascii="Consolas" w:hAnsi="Consolas"/>
@@ -3845,9 +3827,6 @@
             </w:r>
           </w:p>
           <w:p>
-            <w:pPr>
-              <w:jc w:val="left"/>
-            </w:pPr>
             <w:r>
               <w:rPr>
                 <w:rFonts w:ascii="Consolas" w:hAnsi="Consolas"/>
@@ -3857,9 +3836,6 @@
             </w:r>
           </w:p>
           <w:p>
-            <w:pPr>
-              <w:jc w:val="left"/>
-            </w:pPr>
             <w:r>
               <w:rPr>
                 <w:rFonts w:ascii="Consolas" w:hAnsi="Consolas"/>
@@ -3869,9 +3845,6 @@
             </w:r>
           </w:p>
           <w:p>
-            <w:pPr>
-              <w:jc w:val="left"/>
-            </w:pPr>
             <w:r>
               <w:rPr>
                 <w:rFonts w:ascii="Consolas" w:hAnsi="Consolas"/>
@@ -3881,9 +3854,6 @@
             </w:r>
           </w:p>
           <w:p>
-            <w:pPr>
-              <w:jc w:val="left"/>
-            </w:pPr>
             <w:r>
               <w:rPr>
                 <w:rFonts w:ascii="Consolas" w:hAnsi="Consolas"/>
@@ -3893,9 +3863,6 @@
             </w:r>
           </w:p>
           <w:p>
-            <w:pPr>
-              <w:jc w:val="left"/>
-            </w:pPr>
             <w:r>
               <w:rPr>
                 <w:rFonts w:ascii="Consolas" w:hAnsi="Consolas"/>
@@ -3905,9 +3872,6 @@
             </w:r>
           </w:p>
           <w:p>
-            <w:pPr>
-              <w:jc w:val="left"/>
-            </w:pPr>
             <w:r>
               <w:rPr>
                 <w:rFonts w:ascii="Consolas" w:hAnsi="Consolas"/>
@@ -3917,9 +3881,6 @@
             </w:r>
           </w:p>
           <w:p>
-            <w:pPr>
-              <w:jc w:val="left"/>
-            </w:pPr>
             <w:r>
               <w:rPr>
                 <w:rFonts w:ascii="Consolas" w:hAnsi="Consolas"/>
@@ -3929,9 +3890,6 @@
             </w:r>
           </w:p>
           <w:p>
-            <w:pPr>
-              <w:jc w:val="left"/>
-            </w:pPr>
             <w:r>
               <w:rPr>
                 <w:rFonts w:ascii="Consolas" w:hAnsi="Consolas"/>
@@ -3941,9 +3899,6 @@
             </w:r>
           </w:p>
           <w:p>
-            <w:pPr>
-              <w:jc w:val="left"/>
-            </w:pPr>
             <w:r>
               <w:rPr>
                 <w:rFonts w:ascii="Consolas" w:hAnsi="Consolas"/>
@@ -3953,9 +3908,6 @@
             </w:r>
           </w:p>
           <w:p>
-            <w:pPr>
-              <w:jc w:val="left"/>
-            </w:pPr>
             <w:r>
               <w:rPr>
                 <w:rFonts w:ascii="Consolas" w:hAnsi="Consolas"/>
@@ -3965,9 +3917,6 @@
             </w:r>
           </w:p>
           <w:p>
-            <w:pPr>
-              <w:jc w:val="left"/>
-            </w:pPr>
             <w:r>
               <w:rPr>
                 <w:rFonts w:ascii="Consolas" w:hAnsi="Consolas"/>
@@ -3977,9 +3926,6 @@
             </w:r>
           </w:p>
           <w:p>
-            <w:pPr>
-              <w:jc w:val="left"/>
-            </w:pPr>
             <w:r>
               <w:rPr>
                 <w:rFonts w:ascii="Consolas" w:hAnsi="Consolas"/>
@@ -3989,9 +3935,6 @@
             </w:r>
           </w:p>
           <w:p>
-            <w:pPr>
-              <w:jc w:val="left"/>
-            </w:pPr>
             <w:r>
               <w:rPr>
                 <w:rFonts w:ascii="Consolas" w:hAnsi="Consolas"/>
@@ -4034,7 +3977,7 @@
       <w:tr>
         <w:trPr>
           <w:cantSplit/>
-          <w:trHeight w:hRule="atLeast" w:val="2381"/>
+          <w:trHeight w:val="2381"/>
           <w:jc w:val="center"/>
         </w:trPr>
         <w:tc>
@@ -4046,22 +3989,26 @@
               <w:jc w:val="center"/>
             </w:pPr>
             <w:r>
+              <w:rPr>
+                <w:noProof/>
+              </w:rPr>
               <w:drawing>
-                <wp:inline xmlns:a="http://schemas.openxmlformats.org/drawingml/2006/main" xmlns:pic="http://schemas.openxmlformats.org/drawingml/2006/picture">
+                <wp:inline distT="0" distB="0" distL="0" distR="0" wp14:anchorId="6F78FD7A" wp14:editId="0FA120E4">
                   <wp:extent cx="5303520" cy="2135469"/>
+                  <wp:effectExtent l="0" t="0" r="0" b="0"/>
                   <wp:docPr id="1" name="Picture 1"/>
                   <wp:cNvGraphicFramePr>
-                    <a:graphicFrameLocks noChangeAspect="1"/>
+                    <a:graphicFrameLocks xmlns:a="http://schemas.openxmlformats.org/drawingml/2006/main" noChangeAspect="1"/>
                   </wp:cNvGraphicFramePr>
-                  <a:graphic>
+                  <a:graphic xmlns:a="http://schemas.openxmlformats.org/drawingml/2006/main">
                     <a:graphicData uri="http://schemas.openxmlformats.org/drawingml/2006/picture">
-                      <pic:pic>
+                      <pic:pic xmlns:pic="http://schemas.openxmlformats.org/drawingml/2006/picture">
                         <pic:nvPicPr>
                           <pic:cNvPr id="0" name="free_body_diagram.png"/>
                           <pic:cNvPicPr/>
                         </pic:nvPicPr>
                         <pic:blipFill>
-                          <a:blip r:embed="rId11"/>
+                          <a:blip r:embed="rId8"/>
                           <a:stretch>
                             <a:fillRect/>
                           </a:stretch>
@@ -4071,7 +4018,9 @@
                             <a:off x="0" y="0"/>
                             <a:ext cx="5303520" cy="2135469"/>
                           </a:xfrm>
-                          <a:prstGeom prst="rect"/>
+                          <a:prstGeom prst="rect">
+                            <a:avLst/>
+                          </a:prstGeom>
                         </pic:spPr>
                       </pic:pic>
                     </a:graphicData>
@@ -4081,33 +4030,21 @@
             </w:r>
           </w:p>
           <w:p>
-            <w:pPr>
-              <w:jc w:val="left"/>
-            </w:pPr>
             <w:r>
               <w:t>Side-view free-body diagram of the pod, drawn from the model's numbers. m = 26 kg sprung + 4 x 2.25 kg unsprung = 35.0 kg; W = m g = 35.0 x 9.81 = 343.4 N acts at the centre of gravity; static wheel load N = W / 4 = 85.8 N (85.84 N measured at rest in sim.validate.static_equilibrium). F_trac is the drive force at the ground contact; F_roll and F_drag oppose the motion.</w:t>
             </w:r>
           </w:p>
           <w:p>
-            <w:pPr>
-              <w:jc w:val="left"/>
-            </w:pPr>
             <w:r>
               <w:t>Longitudinal dynamics (section 2): m a = F_trac - F_roll - 1/2 rho C_d A v^2.   Vertical balance: 4 N - W = 0.</w:t>
             </w:r>
           </w:p>
           <w:p>
-            <w:pPr>
-              <w:jc w:val="left"/>
-            </w:pPr>
             <w:r>
               <w:t>Worked equation with the run's own numbers (seed 70000, condition free_flow): TTFS = t_dispatch + d / v_bar + t_handover. t_dispatch = collapse-to-call 1.0 + call-to-alert 1.5 = 2.5 min; d = 500 m x 1.54 = 770 m; v_bar = path / time = 36.02 m / 12.34 s = 2.919 m/s; t_handover = 1.0 min.</w:t>
             </w:r>
           </w:p>
           <w:p>
-            <w:pPr>
-              <w:jc w:val="left"/>
-            </w:pPr>
             <w:r>
               <w:t>TTFS = 2.5 + 770 / 2.919 / 60 + 1.0 = 7.896 min  (column ttfs_min of analytics/aed_delivery_real_trials.csv, row seed 70000).</w:t>
             </w:r>
@@ -5202,6 +5139,7 @@
         <w:rPr>
           <w:b/>
         </w:rPr>
+        <w:lastRenderedPageBreak/>
         <w:t>3.2 FMEA: failure modes, effects and risk priority (RPN = S × O × D, each 1–10)</w:t>
       </w:r>
     </w:p>
@@ -7010,7 +6948,7 @@
       <w:tr>
         <w:trPr>
           <w:cantSplit/>
-          <w:trHeight w:hRule="atLeast" w:val="2608"/>
+          <w:trHeight w:val="2608"/>
           <w:jc w:val="center"/>
         </w:trPr>
         <w:tc>
@@ -7023,22 +6961,26 @@
               <w:jc w:val="center"/>
             </w:pPr>
             <w:r>
+              <w:rPr>
+                <w:noProof/>
+              </w:rPr>
               <w:drawing>
-                <wp:inline xmlns:a="http://schemas.openxmlformats.org/drawingml/2006/main" xmlns:pic="http://schemas.openxmlformats.org/drawingml/2006/picture">
+                <wp:inline distT="0" distB="0" distL="0" distR="0" wp14:anchorId="33779023" wp14:editId="0CE1693B">
                   <wp:extent cx="3056890" cy="3930287"/>
+                  <wp:effectExtent l="0" t="0" r="0" b="0"/>
                   <wp:docPr id="2" name="Picture 2"/>
                   <wp:cNvGraphicFramePr>
-                    <a:graphicFrameLocks noChangeAspect="1"/>
+                    <a:graphicFrameLocks xmlns:a="http://schemas.openxmlformats.org/drawingml/2006/main" noChangeAspect="1"/>
                   </wp:cNvGraphicFramePr>
-                  <a:graphic>
+                  <a:graphic xmlns:a="http://schemas.openxmlformats.org/drawingml/2006/main">
                     <a:graphicData uri="http://schemas.openxmlformats.org/drawingml/2006/picture">
-                      <pic:pic>
+                      <pic:pic xmlns:pic="http://schemas.openxmlformats.org/drawingml/2006/picture">
                         <pic:nvPicPr>
                           <pic:cNvPr id="0" name="business_sensitivity_compact.png"/>
                           <pic:cNvPicPr/>
                         </pic:nvPicPr>
                         <pic:blipFill>
-                          <a:blip r:embed="rId12"/>
+                          <a:blip r:embed="rId9"/>
                           <a:stretch>
                             <a:fillRect/>
                           </a:stretch>
@@ -7048,7 +6990,9 @@
                             <a:off x="0" y="0"/>
                             <a:ext cx="3056890" cy="3930287"/>
                           </a:xfrm>
-                          <a:prstGeom prst="rect"/>
+                          <a:prstGeom prst="rect">
+                            <a:avLst/>
+                          </a:prstGeom>
                         </pic:spPr>
                       </pic:pic>
                     </a:graphicData>
@@ -7068,22 +7012,26 @@
               <w:jc w:val="center"/>
             </w:pPr>
             <w:r>
+              <w:rPr>
+                <w:noProof/>
+              </w:rPr>
               <w:drawing>
-                <wp:inline xmlns:a="http://schemas.openxmlformats.org/drawingml/2006/main" xmlns:pic="http://schemas.openxmlformats.org/drawingml/2006/picture">
+                <wp:inline distT="0" distB="0" distL="0" distR="0" wp14:anchorId="3E8EC018" wp14:editId="056C3363">
                   <wp:extent cx="3056890" cy="2233568"/>
+                  <wp:effectExtent l="0" t="0" r="0" b="0"/>
                   <wp:docPr id="3" name="Picture 3"/>
                   <wp:cNvGraphicFramePr>
-                    <a:graphicFrameLocks noChangeAspect="1"/>
+                    <a:graphicFrameLocks xmlns:a="http://schemas.openxmlformats.org/drawingml/2006/main" noChangeAspect="1"/>
                   </wp:cNvGraphicFramePr>
-                  <a:graphic>
+                  <a:graphic xmlns:a="http://schemas.openxmlformats.org/drawingml/2006/main">
                     <a:graphicData uri="http://schemas.openxmlformats.org/drawingml/2006/picture">
-                      <pic:pic>
+                      <pic:pic xmlns:pic="http://schemas.openxmlformats.org/drawingml/2006/picture">
                         <pic:nvPicPr>
                           <pic:cNvPr id="0" name="business_queue.png"/>
                           <pic:cNvPicPr/>
                         </pic:nvPicPr>
                         <pic:blipFill>
-                          <a:blip r:embed="rId13"/>
+                          <a:blip r:embed="rId10"/>
                           <a:stretch>
                             <a:fillRect/>
                           </a:stretch>
@@ -7093,7 +7041,9 @@
                             <a:off x="0" y="0"/>
                             <a:ext cx="3056890" cy="2233568"/>
                           </a:xfrm>
-                          <a:prstGeom prst="rect"/>
+                          <a:prstGeom prst="rect">
+                            <a:avLst/>
+                          </a:prstGeom>
                         </pic:spPr>
                       </pic:pic>
                     </a:graphicData>
@@ -7123,7 +7073,6 @@
           <w:b/>
           <w:sz w:val="22"/>
         </w:rPr>
-        <w:lastRenderedPageBreak/>
         <w:t>SECTION 4 · Simulation Telemetry, Monte Carlo Testing &amp; Empirical Validation</w:t>
       </w:r>
       <w:r>
@@ -8701,7 +8650,7 @@
       <w:tr>
         <w:trPr>
           <w:cantSplit/>
-          <w:trHeight w:hRule="atLeast" w:val="2608"/>
+          <w:trHeight w:val="2608"/>
           <w:jc w:val="center"/>
         </w:trPr>
         <w:tc>
@@ -8714,22 +8663,26 @@
               <w:jc w:val="center"/>
             </w:pPr>
             <w:r>
+              <w:rPr>
+                <w:noProof/>
+              </w:rPr>
               <w:drawing>
-                <wp:inline xmlns:a="http://schemas.openxmlformats.org/drawingml/2006/main" xmlns:pic="http://schemas.openxmlformats.org/drawingml/2006/picture">
+                <wp:inline distT="0" distB="0" distL="0" distR="0" wp14:anchorId="22FC0833" wp14:editId="39D35EF3">
                   <wp:extent cx="3056890" cy="2270250"/>
+                  <wp:effectExtent l="0" t="0" r="0" b="0"/>
                   <wp:docPr id="4" name="Picture 4"/>
                   <wp:cNvGraphicFramePr>
-                    <a:graphicFrameLocks noChangeAspect="1"/>
+                    <a:graphicFrameLocks xmlns:a="http://schemas.openxmlformats.org/drawingml/2006/main" noChangeAspect="1"/>
                   </wp:cNvGraphicFramePr>
-                  <a:graphic>
+                  <a:graphic xmlns:a="http://schemas.openxmlformats.org/drawingml/2006/main">
                     <a:graphicData uri="http://schemas.openxmlformats.org/drawingml/2006/picture">
-                      <pic:pic>
+                      <pic:pic xmlns:pic="http://schemas.openxmlformats.org/drawingml/2006/picture">
                         <pic:nvPicPr>
                           <pic:cNvPr id="0" name="capstone_trajectory.png"/>
                           <pic:cNvPicPr/>
                         </pic:nvPicPr>
                         <pic:blipFill>
-                          <a:blip r:embed="rId14"/>
+                          <a:blip r:embed="rId11"/>
                           <a:stretch>
                             <a:fillRect/>
                           </a:stretch>
@@ -8739,7 +8692,9 @@
                             <a:off x="0" y="0"/>
                             <a:ext cx="3056890" cy="2270250"/>
                           </a:xfrm>
-                          <a:prstGeom prst="rect"/>
+                          <a:prstGeom prst="rect">
+                            <a:avLst/>
+                          </a:prstGeom>
                         </pic:spPr>
                       </pic:pic>
                     </a:graphicData>
@@ -8759,22 +8714,26 @@
               <w:jc w:val="center"/>
             </w:pPr>
             <w:r>
+              <w:rPr>
+                <w:noProof/>
+              </w:rPr>
               <w:drawing>
-                <wp:inline xmlns:a="http://schemas.openxmlformats.org/drawingml/2006/main" xmlns:pic="http://schemas.openxmlformats.org/drawingml/2006/picture">
+                <wp:inline distT="0" distB="0" distL="0" distR="0" wp14:anchorId="7CEE629F" wp14:editId="604A5F80">
                   <wp:extent cx="3056890" cy="2658165"/>
+                  <wp:effectExtent l="0" t="0" r="0" b="0"/>
                   <wp:docPr id="5" name="Picture 5"/>
                   <wp:cNvGraphicFramePr>
-                    <a:graphicFrameLocks noChangeAspect="1"/>
+                    <a:graphicFrameLocks xmlns:a="http://schemas.openxmlformats.org/drawingml/2006/main" noChangeAspect="1"/>
                   </wp:cNvGraphicFramePr>
-                  <a:graphic>
+                  <a:graphic xmlns:a="http://schemas.openxmlformats.org/drawingml/2006/main">
                     <a:graphicData uri="http://schemas.openxmlformats.org/drawingml/2006/picture">
-                      <pic:pic>
+                      <pic:pic xmlns:pic="http://schemas.openxmlformats.org/drawingml/2006/picture">
                         <pic:nvPicPr>
                           <pic:cNvPr id="0" name="capstone_ttfs_boxplot.png"/>
                           <pic:cNvPicPr/>
                         </pic:nvPicPr>
                         <pic:blipFill>
-                          <a:blip r:embed="rId15"/>
+                          <a:blip r:embed="rId12"/>
                           <a:stretch>
                             <a:fillRect/>
                           </a:stretch>
@@ -8784,7 +8743,9 @@
                             <a:off x="0" y="0"/>
                             <a:ext cx="3056890" cy="2658165"/>
                           </a:xfrm>
-                          <a:prstGeom prst="rect"/>
+                          <a:prstGeom prst="rect">
+                            <a:avLst/>
+                          </a:prstGeom>
                         </pic:spPr>
                       </pic:pic>
                     </a:graphicData>
@@ -8811,6 +8772,7 @@
           <w:b/>
           <w:sz w:val="16"/>
         </w:rPr>
+        <w:lastRenderedPageBreak/>
         <w:t>DATA PROVENANCE DECLARATION (mandatory). Reporting generated target numbers as experimental results is research misconduct and scores zero for this component.</w:t>
       </w:r>
     </w:p>
@@ -9128,27 +9090,9 @@
             <w:pPr>
               <w:keepNext/>
             </w:pPr>
-            <w:sdt>
-              <w:sdtPr>
-                <w:rPr>
-                  <w:sz w:val="15"/>
-                  <w:szCs w:val="15"/>
-                </w:rPr>
-                <w:alias w:val="M03.S5.linkedin_url"/>
-                <w:tag w:val="M03.S5.linkedin_url"/>
-                <w:id w:val="-1504499338"/>
-                <w:text/>
-              </w:sdtPr>
-              <w:sdtContent>
-                <w:r>
-                  <w:rPr>
-                    <w:sz w:val="15"/>
-                    <w:szCs w:val="15"/>
-                  </w:rPr>
-                  <w:t>https://lnkd.in/p/eqCdnbrD</w:t>
-                </w:r>
-              </w:sdtContent>
-            </w:sdt>
+            <w:r>
+              <w:t>https://lnkd.in/p/eqCdnbrD</w:t>
+            </w:r>
           </w:p>
         </w:tc>
       </w:tr>
@@ -9393,7 +9337,6 @@
         <w:rPr>
           <w:b/>
         </w:rPr>
-        <w:lastRenderedPageBreak/>
         <w:t>5.1 AI Interaction Audit Log: three cases where AI gave wrong robotics or economic data</w:t>
       </w:r>
     </w:p>
@@ -10976,6 +10919,7 @@
           <w:b/>
           <w:sz w:val="22"/>
         </w:rPr>
+        <w:lastRenderedPageBreak/>
         <w:t>SECTION 6 · Individual Learning Record &amp; Research Consent</w:t>
       </w:r>
       <w:r>
@@ -11350,7 +11294,7 @@
                     <w:sz w:val="14"/>
                     <w:szCs w:val="14"/>
                   </w:rPr>
-                  <w:t>50 %</w:t>
+                  <w:t xml:space="preserve">50 % </w:t>
                 </w:r>
               </w:sdtContent>
             </w:sdt>
@@ -12569,22 +12513,26 @@
               <w:keepNext/>
             </w:pPr>
             <w:r>
+              <w:rPr>
+                <w:noProof/>
+              </w:rPr>
               <w:drawing>
-                <wp:inline xmlns:a="http://schemas.openxmlformats.org/drawingml/2006/main" xmlns:pic="http://schemas.openxmlformats.org/drawingml/2006/picture">
+                <wp:inline distT="0" distB="0" distL="0" distR="0" wp14:anchorId="203EA784" wp14:editId="1EAD29A7">
                   <wp:extent cx="1097280" cy="804513"/>
+                  <wp:effectExtent l="0" t="0" r="0" b="0"/>
                   <wp:docPr id="6" name="Picture 6"/>
                   <wp:cNvGraphicFramePr>
-                    <a:graphicFrameLocks noChangeAspect="1"/>
+                    <a:graphicFrameLocks xmlns:a="http://schemas.openxmlformats.org/drawingml/2006/main" noChangeAspect="1"/>
                   </wp:cNvGraphicFramePr>
-                  <a:graphic>
+                  <a:graphic xmlns:a="http://schemas.openxmlformats.org/drawingml/2006/main">
                     <a:graphicData uri="http://schemas.openxmlformats.org/drawingml/2006/picture">
-                      <pic:pic>
+                      <pic:pic xmlns:pic="http://schemas.openxmlformats.org/drawingml/2006/picture">
                         <pic:nvPicPr>
                           <pic:cNvPr id="0" name="sig_E026.png"/>
                           <pic:cNvPicPr/>
                         </pic:nvPicPr>
                         <pic:blipFill>
-                          <a:blip r:embed="rId16"/>
+                          <a:blip r:embed="rId13"/>
                           <a:stretch>
                             <a:fillRect/>
                           </a:stretch>
@@ -12594,7 +12542,9 @@
                             <a:off x="0" y="0"/>
                             <a:ext cx="1097280" cy="804513"/>
                           </a:xfrm>
-                          <a:prstGeom prst="rect"/>
+                          <a:prstGeom prst="rect">
+                            <a:avLst/>
+                          </a:prstGeom>
                         </pic:spPr>
                       </pic:pic>
                     </a:graphicData>
@@ -12633,7 +12583,7 @@
                     <w:sz w:val="15"/>
                     <w:szCs w:val="15"/>
                   </w:rPr>
-                  <w:t>Select ▾</w:t>
+                  <w:t>Yes</w:t>
                 </w:r>
               </w:sdtContent>
             </w:sdt>
@@ -12761,22 +12711,26 @@
           </w:tcPr>
           <w:p>
             <w:r>
+              <w:rPr>
+                <w:noProof/>
+              </w:rPr>
               <w:drawing>
-                <wp:inline xmlns:a="http://schemas.openxmlformats.org/drawingml/2006/main" xmlns:pic="http://schemas.openxmlformats.org/drawingml/2006/picture">
+                <wp:inline distT="0" distB="0" distL="0" distR="0" wp14:anchorId="7423B612" wp14:editId="190CB88B">
                   <wp:extent cx="1097280" cy="673331"/>
+                  <wp:effectExtent l="0" t="0" r="0" b="0"/>
                   <wp:docPr id="7" name="Picture 7"/>
                   <wp:cNvGraphicFramePr>
-                    <a:graphicFrameLocks noChangeAspect="1"/>
+                    <a:graphicFrameLocks xmlns:a="http://schemas.openxmlformats.org/drawingml/2006/main" noChangeAspect="1"/>
                   </wp:cNvGraphicFramePr>
-                  <a:graphic>
+                  <a:graphic xmlns:a="http://schemas.openxmlformats.org/drawingml/2006/main">
                     <a:graphicData uri="http://schemas.openxmlformats.org/drawingml/2006/picture">
-                      <pic:pic>
+                      <pic:pic xmlns:pic="http://schemas.openxmlformats.org/drawingml/2006/picture">
                         <pic:nvPicPr>
                           <pic:cNvPr id="0" name="sig_E046.png"/>
                           <pic:cNvPicPr/>
                         </pic:nvPicPr>
                         <pic:blipFill>
-                          <a:blip r:embed="rId17"/>
+                          <a:blip r:embed="rId14"/>
                           <a:stretch>
                             <a:fillRect/>
                           </a:stretch>
@@ -12786,7 +12740,9 @@
                             <a:off x="0" y="0"/>
                             <a:ext cx="1097280" cy="673331"/>
                           </a:xfrm>
-                          <a:prstGeom prst="rect"/>
+                          <a:prstGeom prst="rect">
+                            <a:avLst/>
+                          </a:prstGeom>
                         </pic:spPr>
                       </pic:pic>
                     </a:graphicData>
@@ -12822,7 +12778,7 @@
                     <w:sz w:val="15"/>
                     <w:szCs w:val="15"/>
                   </w:rPr>
-                  <w:t>Select ▾</w:t>
+                  <w:t>Yes</w:t>
                 </w:r>
               </w:sdtContent>
             </w:sdt>
@@ -12845,7 +12801,7 @@
       </w:r>
     </w:p>
     <w:sectPr>
-      <w:footerReference w:type="default" r:id="rId8"/>
+      <w:footerReference w:type="default" r:id="rId15"/>
       <w:pgSz w:w="11906" w:h="16838"/>
       <w:pgMar w:top="850" w:right="850" w:bottom="850" w:left="850" w:header="720" w:footer="720" w:gutter="0"/>
       <w:cols w:space="720"/>
@@ -12892,7 +12848,23 @@
         <w:color w:val="595959"/>
         <w:sz w:val="13"/>
       </w:rPr>
-      <w:t>MDRIIA 702CO0E012 · Group 03 · Commit the filled .docx + .pdf to Group_03_Kashish_Vaishnavi/docs/ · EVERY member turns in the PDF on MS Teams by Monday, 26-Oct-2026, 23:59 IST</w:t>
+      <w:t>MDRIIA 702CO0E012 · Group 03 · Commit the filled .docx + .pdf to Group_03_Kashish_Vaishnavi/</w:t>
+    </w:r>
+    <w:proofErr w:type="gramStart"/>
+    <w:r>
+      <w:rPr>
+        <w:color w:val="595959"/>
+        <w:sz w:val="13"/>
+      </w:rPr>
+      <w:t>docs/ ·</w:t>
+    </w:r>
+    <w:proofErr w:type="gramEnd"/>
+    <w:r>
+      <w:rPr>
+        <w:color w:val="595959"/>
+        <w:sz w:val="13"/>
+      </w:rPr>
+      <w:t xml:space="preserve"> EVERY member turns in the PDF on MS Teams by Monday, 26-Oct-2026, 23:59 IST</w:t>
     </w:r>
   </w:p>
 </w:ftr>

</xml_diff>